<commit_message>
Uploading of revised 100% must Haves
</commit_message>
<xml_diff>
--- a/Contx - must Haves 100%.docx
+++ b/Contx - must Haves 100%.docx
@@ -7,7 +7,7 @@
         <w:pStyle w:val="Heading1"/>
         <w:keepNext w:val="0"/>
         <w:keepLines w:val="0"/>
-        <w:spacing w:after="240" w:before="240" w:lineRule="auto"/>
+        <w:spacing w:after="240" w:before="240" w:line="276" w:lineRule="auto"/>
         <w:rPr>
           <w:sz w:val="50"/>
           <w:szCs w:val="50"/>
@@ -31,7 +31,7 @@
     </w:p>
     <w:p>
       <w:pPr>
-        <w:spacing w:after="240" w:before="240" w:lineRule="auto"/>
+        <w:spacing w:after="240" w:before="240" w:line="276" w:lineRule="auto"/>
         <w:rPr/>
       </w:pPr>
       <w:bookmarkStart w:colFirst="0" w:colLast="0" w:name="_6h59nhk5i8l5" w:id="0"/>
@@ -45,7 +45,7 @@
     </w:p>
     <w:p>
       <w:pPr>
-        <w:spacing w:after="240" w:before="240" w:lineRule="auto"/>
+        <w:spacing w:after="240" w:before="240" w:line="276" w:lineRule="auto"/>
         <w:rPr>
           <w:b w:val="1"/>
           <w:bCs w:val="1"/>
@@ -62,7 +62,7 @@
     </w:p>
     <w:p>
       <w:pPr>
-        <w:spacing w:before="240" w:lineRule="auto"/>
+        <w:spacing w:before="240" w:line="276" w:lineRule="auto"/>
         <w:ind w:left="1080" w:hanging="360"/>
         <w:rPr/>
       </w:pPr>
@@ -89,6 +89,7 @@
     </w:p>
     <w:p>
       <w:pPr>
+        <w:spacing w:line="276" w:lineRule="auto"/>
         <w:ind w:left="1080" w:hanging="360"/>
         <w:rPr/>
       </w:pPr>
@@ -115,7 +116,7 @@
     </w:p>
     <w:p>
       <w:pPr>
-        <w:spacing w:after="240" w:lineRule="auto"/>
+        <w:spacing w:after="240" w:line="276" w:lineRule="auto"/>
         <w:ind w:left="1080" w:hanging="360"/>
         <w:rPr/>
       </w:pPr>
@@ -145,7 +146,7 @@
         <w:pStyle w:val="Heading1"/>
         <w:keepNext w:val="0"/>
         <w:keepLines w:val="0"/>
-        <w:spacing w:after="240" w:before="240" w:lineRule="auto"/>
+        <w:spacing w:after="240" w:before="240" w:line="276" w:lineRule="auto"/>
         <w:rPr>
           <w:b w:val="1"/>
           <w:bCs w:val="1"/>
@@ -168,6 +169,7 @@
     </w:p>
     <w:p>
       <w:pPr>
+        <w:spacing w:line="276" w:lineRule="auto"/>
         <w:rPr>
           <w:b w:val="1"/>
           <w:bCs w:val="1"/>
@@ -188,7 +190,7 @@
     </w:p>
     <w:p>
       <w:pPr>
-        <w:spacing w:after="240" w:before="240" w:lineRule="auto"/>
+        <w:spacing w:after="240" w:before="240" w:line="276" w:lineRule="auto"/>
         <w:jc w:val="both"/>
         <w:rPr>
           <w:b w:val="1"/>
@@ -206,7 +208,7 @@
     </w:p>
     <w:p>
       <w:pPr>
-        <w:spacing w:after="240" w:before="240" w:lineRule="auto"/>
+        <w:spacing w:after="240" w:before="240" w:line="276" w:lineRule="auto"/>
         <w:jc w:val="both"/>
         <w:rPr/>
       </w:pPr>
@@ -219,7 +221,7 @@
     </w:p>
     <w:p>
       <w:pPr>
-        <w:spacing w:after="240" w:before="240" w:lineRule="auto"/>
+        <w:spacing w:after="240" w:before="240" w:line="276" w:lineRule="auto"/>
         <w:jc w:val="both"/>
         <w:rPr/>
       </w:pPr>
@@ -234,18 +236,702 @@
       <w:pPr>
         <w:numPr>
           <w:ilvl w:val="0"/>
+          <w:numId w:val="8"/>
+        </w:numPr>
+        <w:spacing w:before="240" w:line="276" w:lineRule="auto"/>
+        <w:ind w:left="720" w:hanging="360"/>
+        <w:jc w:val="both"/>
+        <w:rPr/>
+      </w:pPr>
+      <w:r>
+        <w:rPr>
+          <w:rtl w:val="0"/>
+        </w:rPr>
+        <w:t xml:space="preserve">When the student starts the desktop application lockdown activates in their device</w:t>
+      </w:r>
+      <w:r>
+        <w:rPr>
+          <w:rtl w:val="0"/>
+        </w:rPr>
+      </w:r>
+    </w:p>
+    <w:p>
+      <w:pPr>
+        <w:numPr>
+          <w:ilvl w:val="0"/>
+          <w:numId w:val="8"/>
+        </w:numPr>
+        <w:spacing w:line="276" w:lineRule="auto"/>
+        <w:ind w:left="720" w:hanging="360"/>
+        <w:jc w:val="both"/>
+        <w:rPr/>
+      </w:pPr>
+      <w:r>
+        <w:rPr>
+          <w:rtl w:val="0"/>
+        </w:rPr>
+        <w:t xml:space="preserve">The following are intercepted and suppressed via low-level keyboard hooks: </w:t>
+      </w:r>
+    </w:p>
+    <w:p>
+      <w:pPr>
+        <w:numPr>
+          <w:ilvl w:val="1"/>
+          <w:numId w:val="8"/>
+        </w:numPr>
+        <w:spacing w:line="276" w:lineRule="auto"/>
+        <w:ind w:left="1440" w:hanging="360"/>
+        <w:jc w:val="both"/>
+        <w:rPr/>
+      </w:pPr>
+      <w:r>
+        <w:rPr>
+          <w:rtl w:val="0"/>
+        </w:rPr>
+        <w:t xml:space="preserve">Alt+Tab and all application-switching shortcuts</w:t>
+      </w:r>
+    </w:p>
+    <w:p>
+      <w:pPr>
+        <w:numPr>
+          <w:ilvl w:val="1"/>
+          <w:numId w:val="8"/>
+        </w:numPr>
+        <w:spacing w:line="276" w:lineRule="auto"/>
+        <w:ind w:left="1440" w:hanging="360"/>
+        <w:jc w:val="both"/>
+        <w:rPr/>
+      </w:pPr>
+      <w:r>
+        <w:rPr>
+          <w:rtl w:val="0"/>
+        </w:rPr>
+        <w:t xml:space="preserve">The Windows key and Start menu</w:t>
+      </w:r>
+    </w:p>
+    <w:p>
+      <w:pPr>
+        <w:numPr>
+          <w:ilvl w:val="1"/>
+          <w:numId w:val="8"/>
+        </w:numPr>
+        <w:spacing w:line="276" w:lineRule="auto"/>
+        <w:ind w:left="1440" w:hanging="360"/>
+        <w:jc w:val="both"/>
+        <w:rPr/>
+      </w:pPr>
+      <w:r>
+        <w:rPr>
+          <w:rtl w:val="0"/>
+        </w:rPr>
+        <w:t xml:space="preserve">Task Manager (Ctrl+Shift+Esc and Ctrl+Alt+Del handling)</w:t>
+      </w:r>
+    </w:p>
+    <w:p>
+      <w:pPr>
+        <w:numPr>
+          <w:ilvl w:val="1"/>
+          <w:numId w:val="8"/>
+        </w:numPr>
+        <w:spacing w:line="276" w:lineRule="auto"/>
+        <w:ind w:left="1440" w:hanging="360"/>
+        <w:jc w:val="both"/>
+        <w:rPr/>
+      </w:pPr>
+      <w:r>
+        <w:rPr>
+          <w:rtl w:val="0"/>
+        </w:rPr>
+        <w:t xml:space="preserve">Copy-paste shortcuts (Ctrl+C, Ctrl+V, Ctrl+X)</w:t>
+      </w:r>
+    </w:p>
+    <w:p>
+      <w:pPr>
+        <w:numPr>
+          <w:ilvl w:val="1"/>
+          <w:numId w:val="8"/>
+        </w:numPr>
+        <w:spacing w:line="276" w:lineRule="auto"/>
+        <w:ind w:left="1440" w:hanging="360"/>
+        <w:jc w:val="both"/>
+        <w:rPr/>
+      </w:pPr>
+      <w:r>
+        <w:rPr>
+          <w:rtl w:val="0"/>
+        </w:rPr>
+        <w:t xml:space="preserve">Screenshot tools (PrintScreen, Win+Shift+S)</w:t>
+      </w:r>
+    </w:p>
+    <w:p>
+      <w:pPr>
+        <w:numPr>
+          <w:ilvl w:val="0"/>
+          <w:numId w:val="8"/>
+        </w:numPr>
+        <w:spacing w:line="276" w:lineRule="auto"/>
+        <w:ind w:left="720" w:hanging="360"/>
+        <w:jc w:val="both"/>
+        <w:rPr/>
+      </w:pPr>
+      <w:r>
+        <w:rPr>
+          <w:rtl w:val="0"/>
+        </w:rPr>
+        <w:t xml:space="preserve">A fullscreen, always-on-top kiosk window captures focus so no background application can receive input.</w:t>
+      </w:r>
+    </w:p>
+    <w:p>
+      <w:pPr>
+        <w:numPr>
+          <w:ilvl w:val="0"/>
+          <w:numId w:val="8"/>
+        </w:numPr>
+        <w:spacing w:line="276" w:lineRule="auto"/>
+        <w:ind w:left="720" w:hanging="360"/>
+        <w:jc w:val="both"/>
+        <w:rPr/>
+      </w:pPr>
+      <w:r>
+        <w:rPr>
+          <w:rtl w:val="0"/>
+        </w:rPr>
+        <w:t xml:space="preserve">Active process monitoring detects and flags any attempt to open disallowed applications </w:t>
+      </w:r>
+    </w:p>
+    <w:p>
+      <w:pPr>
+        <w:numPr>
+          <w:ilvl w:val="0"/>
+          <w:numId w:val="8"/>
+        </w:numPr>
+        <w:spacing w:line="276" w:lineRule="auto"/>
+        <w:ind w:left="720" w:hanging="360"/>
+        <w:jc w:val="both"/>
+        <w:rPr/>
+      </w:pPr>
+      <w:r>
+        <w:rPr>
+          <w:rtl w:val="0"/>
+        </w:rPr>
+        <w:t xml:space="preserve">Any bypass attempt is silently logged with a timestamp and flagged immediately on the teacher dashboard.</w:t>
+      </w:r>
+      <w:r>
+        <w:rPr>
+          <w:rtl w:val="0"/>
+        </w:rPr>
+      </w:r>
+    </w:p>
+    <w:p>
+      <w:pPr>
+        <w:numPr>
+          <w:ilvl w:val="0"/>
+          <w:numId w:val="5"/>
+        </w:numPr>
+        <w:spacing w:line="276" w:lineRule="auto"/>
+        <w:ind w:left="720" w:hanging="360"/>
+        <w:rPr/>
+      </w:pPr>
+      <w:r>
+        <w:rPr>
+          <w:rtl w:val="0"/>
+        </w:rPr>
+        <w:t xml:space="preserve">The system records and monitors student keystroke activity during the examination session for audit and behavioral review.</w:t>
+      </w:r>
+      <w:r>
+        <w:rPr>
+          <w:rtl w:val="0"/>
+        </w:rPr>
+      </w:r>
+    </w:p>
+    <w:p>
+      <w:pPr>
+        <w:numPr>
+          <w:ilvl w:val="0"/>
+          <w:numId w:val="5"/>
+        </w:numPr>
+        <w:spacing w:line="276" w:lineRule="auto"/>
+        <w:ind w:left="720" w:hanging="360"/>
+        <w:rPr/>
+      </w:pPr>
+      <w:r>
+        <w:rPr>
+          <w:rtl w:val="0"/>
+        </w:rPr>
+        <w:t xml:space="preserve">Keystroke logs are timestamped and associated with specific question interactions.</w:t>
+      </w:r>
+      <w:r>
+        <w:rPr>
+          <w:rtl w:val="0"/>
+        </w:rPr>
+      </w:r>
+    </w:p>
+    <w:p>
+      <w:pPr>
+        <w:numPr>
+          <w:ilvl w:val="0"/>
+          <w:numId w:val="5"/>
+        </w:numPr>
+        <w:spacing w:line="276" w:lineRule="auto"/>
+        <w:ind w:left="720" w:hanging="360"/>
+        <w:rPr/>
+      </w:pPr>
+      <w:r>
+        <w:rPr>
+          <w:rtl w:val="0"/>
+        </w:rPr>
+        <w:t xml:space="preserve">Keystroke monitoring applies only during an exam session inside the application and is used for academic integrity investigation and incident reporting.</w:t>
+      </w:r>
+      <w:r>
+        <w:rPr>
+          <w:rtl w:val="0"/>
+        </w:rPr>
+      </w:r>
+    </w:p>
+    <w:p>
+      <w:pPr>
+        <w:numPr>
+          <w:ilvl w:val="0"/>
+          <w:numId w:val="8"/>
+        </w:numPr>
+        <w:spacing w:line="276" w:lineRule="auto"/>
+        <w:ind w:left="720" w:hanging="360"/>
+        <w:jc w:val="both"/>
+        <w:rPr/>
+      </w:pPr>
+      <w:r>
+        <w:rPr>
+          <w:rtl w:val="0"/>
+        </w:rPr>
+        <w:t xml:space="preserve">Lockdown is lifted when the student finishes the exam and leaves the desktop application.</w:t>
+      </w:r>
+    </w:p>
+    <w:p>
+      <w:pPr>
+        <w:numPr>
+          <w:ilvl w:val="0"/>
+          <w:numId w:val="8"/>
+        </w:numPr>
+        <w:spacing w:after="240" w:line="276" w:lineRule="auto"/>
+        <w:ind w:left="720" w:hanging="360"/>
+        <w:jc w:val="both"/>
+        <w:rPr/>
+      </w:pPr>
+      <w:r>
+        <w:rPr>
+          <w:rtl w:val="0"/>
+        </w:rPr>
+        <w:t xml:space="preserve">Upon launching the application, the system automatically closes all non-essential applications and</w:t>
+      </w:r>
+      <w:r>
+        <w:rPr>
+          <w:rtl w:val="0"/>
+        </w:rPr>
+        <w:t xml:space="preserve"> mutes system audio before the student can access any exam, activity, or assignment.</w:t>
+      </w:r>
+      <w:r>
+        <w:rPr>
+          <w:rtl w:val="0"/>
+        </w:rPr>
+      </w:r>
+    </w:p>
+    <w:p>
+      <w:pPr>
+        <w:spacing w:after="240" w:before="240" w:line="276" w:lineRule="auto"/>
+        <w:jc w:val="both"/>
+        <w:rPr>
+          <w:b w:val="1"/>
+          <w:bCs w:val="1"/>
+        </w:rPr>
+      </w:pPr>
+      <w:r>
+        <w:rPr>
+          <w:b w:val="1"/>
+          <w:bCs w:val="1"/>
+          <w:rtl w:val="0"/>
+        </w:rPr>
+        <w:t xml:space="preserve">2. Local Code Compiler and Automated Assessment Engine</w:t>
+      </w:r>
+    </w:p>
+    <w:p>
+      <w:pPr>
+        <w:spacing w:after="240" w:before="240" w:line="276" w:lineRule="auto"/>
+        <w:jc w:val="both"/>
+        <w:rPr/>
+      </w:pPr>
+      <w:r>
+        <w:rPr>
+          <w:rtl w:val="0"/>
+        </w:rPr>
+        <w:t xml:space="preserve">The platform runs its own code execution engine locally. No external grading API or internet connection is involved.</w:t>
+      </w:r>
+    </w:p>
+    <w:p>
+      <w:pPr>
+        <w:numPr>
+          <w:ilvl w:val="0"/>
+          <w:numId w:val="12"/>
+        </w:numPr>
+        <w:spacing w:before="240" w:line="276" w:lineRule="auto"/>
+        <w:ind w:left="720" w:hanging="360"/>
+        <w:jc w:val="both"/>
+        <w:rPr/>
+      </w:pPr>
+      <w:r>
+        <w:rPr>
+          <w:rtl w:val="0"/>
+        </w:rPr>
+        <w:t xml:space="preserve">Supports C using compiler and runtime tools pre-installed on the host machine (GCC for C).</w:t>
+      </w:r>
+      <w:r>
+        <w:rPr>
+          <w:rtl w:val="0"/>
+        </w:rPr>
+      </w:r>
+    </w:p>
+    <w:p>
+      <w:pPr>
+        <w:numPr>
+          <w:ilvl w:val="0"/>
+          <w:numId w:val="12"/>
+        </w:numPr>
+        <w:spacing w:line="276" w:lineRule="auto"/>
+        <w:ind w:left="720" w:hanging="360"/>
+        <w:jc w:val="both"/>
+        <w:rPr/>
+      </w:pPr>
+      <w:r>
+        <w:rPr>
+          <w:rtl w:val="0"/>
+        </w:rPr>
+        <w:t xml:space="preserve">Students may check their code against the assessment engine before final submission.</w:t>
+      </w:r>
+    </w:p>
+    <w:p>
+      <w:pPr>
+        <w:numPr>
+          <w:ilvl w:val="0"/>
+          <w:numId w:val="12"/>
+        </w:numPr>
+        <w:spacing w:line="276" w:lineRule="auto"/>
+        <w:ind w:left="720" w:hanging="360"/>
+        <w:jc w:val="both"/>
+        <w:rPr/>
+      </w:pPr>
+      <w:r>
+        <w:rPr>
+          <w:rtl w:val="0"/>
+        </w:rPr>
+        <w:t xml:space="preserve">Each code check attempt incurs a teacher-configurable point deduction to discourage excessive trial-and-error submissions and encourage problem-solving before verification. </w:t>
+      </w:r>
+    </w:p>
+    <w:p>
+      <w:pPr>
+        <w:numPr>
+          <w:ilvl w:val="0"/>
+          <w:numId w:val="12"/>
+        </w:numPr>
+        <w:spacing w:line="276" w:lineRule="auto"/>
+        <w:ind w:left="720" w:hanging="360"/>
+        <w:jc w:val="both"/>
+        <w:rPr/>
+      </w:pPr>
+      <w:r>
+        <w:rPr>
+          <w:rtl w:val="0"/>
+        </w:rPr>
+        <w:t xml:space="preserve">The system records the number of code check attempts made by each student during the examination. </w:t>
+      </w:r>
+    </w:p>
+    <w:p>
+      <w:pPr>
+        <w:numPr>
+          <w:ilvl w:val="0"/>
+          <w:numId w:val="12"/>
+        </w:numPr>
+        <w:spacing w:line="276" w:lineRule="auto"/>
+        <w:ind w:left="720" w:hanging="360"/>
+        <w:jc w:val="both"/>
+        <w:rPr/>
+      </w:pPr>
+      <w:r>
+        <w:rPr>
+          <w:rtl w:val="0"/>
+        </w:rPr>
+        <w:t xml:space="preserve">Final scores for coding questions are automatically adjusted based on the configured deduction rules and the student's total number of code check attempts. </w:t>
+      </w:r>
+    </w:p>
+    <w:p>
+      <w:pPr>
+        <w:numPr>
+          <w:ilvl w:val="0"/>
+          <w:numId w:val="12"/>
+        </w:numPr>
+        <w:spacing w:line="276" w:lineRule="auto"/>
+        <w:ind w:left="720" w:hanging="360"/>
+        <w:jc w:val="both"/>
+        <w:rPr/>
+      </w:pPr>
+      <w:r>
+        <w:rPr>
+          <w:rtl w:val="0"/>
+        </w:rPr>
+        <w:t xml:space="preserve">On submission, the engine compiles the student's code, runs it against visible and hidden teacher-defined test cases, compares output, and returns a pass/fail result with partial credit scoring.</w:t>
+      </w:r>
+    </w:p>
+    <w:p>
+      <w:pPr>
+        <w:numPr>
+          <w:ilvl w:val="0"/>
+          <w:numId w:val="12"/>
+        </w:numPr>
+        <w:spacing w:line="276" w:lineRule="auto"/>
+        <w:ind w:left="720" w:hanging="360"/>
+        <w:jc w:val="both"/>
+        <w:rPr/>
+      </w:pPr>
+      <w:r>
+        <w:rPr>
+          <w:rtl w:val="0"/>
+        </w:rPr>
+        <w:t xml:space="preserve">Each execution runs in process isolation with a configurable time limit and automatic temporary file cleanup.</w:t>
+      </w:r>
+    </w:p>
+    <w:p>
+      <w:pPr>
+        <w:numPr>
+          <w:ilvl w:val="0"/>
+          <w:numId w:val="12"/>
+        </w:numPr>
+        <w:spacing w:line="276" w:lineRule="auto"/>
+        <w:ind w:left="720" w:hanging="360"/>
+        <w:jc w:val="both"/>
+        <w:rPr/>
+      </w:pPr>
+      <w:r>
+        <w:rPr>
+          <w:rtl w:val="0"/>
+        </w:rPr>
+        <w:t xml:space="preserve">One student's submission cannot affect another's execution environment.</w:t>
+      </w:r>
+      <w:r>
+        <w:rPr>
+          <w:rtl w:val="0"/>
+        </w:rPr>
+      </w:r>
+    </w:p>
+    <w:p>
+      <w:pPr>
+        <w:spacing w:after="240" w:before="240" w:line="276" w:lineRule="auto"/>
+        <w:jc w:val="both"/>
+        <w:rPr>
+          <w:b w:val="1"/>
+          <w:bCs w:val="1"/>
+        </w:rPr>
+      </w:pPr>
+      <w:r>
+        <w:rPr>
+          <w:b w:val="1"/>
+          <w:bCs w:val="1"/>
+          <w:rtl w:val="0"/>
+        </w:rPr>
+        <w:t xml:space="preserve">3. In-App Code Editor for Students</w:t>
+      </w:r>
+    </w:p>
+    <w:p>
+      <w:pPr>
+        <w:numPr>
+          <w:ilvl w:val="0"/>
+          <w:numId w:val="2"/>
+        </w:numPr>
+        <w:spacing w:before="240" w:line="276" w:lineRule="auto"/>
+        <w:ind w:left="720" w:hanging="360"/>
+        <w:jc w:val="both"/>
+        <w:rPr/>
+      </w:pPr>
+      <w:r>
+        <w:rPr>
+          <w:rtl w:val="0"/>
+        </w:rPr>
+        <w:t xml:space="preserve">Students write and run code inside a built-in Monaco editor (the same engine powering Visual Studio Code) rendered within the locked application window.</w:t>
+      </w:r>
+    </w:p>
+    <w:p>
+      <w:pPr>
+        <w:numPr>
+          <w:ilvl w:val="0"/>
+          <w:numId w:val="2"/>
+        </w:numPr>
+        <w:spacing w:line="276" w:lineRule="auto"/>
+        <w:ind w:left="720" w:hanging="360"/>
+        <w:jc w:val="both"/>
+        <w:rPr/>
+      </w:pPr>
+      <w:r>
+        <w:rPr>
+          <w:rtl w:val="0"/>
+        </w:rPr>
+        <w:t xml:space="preserve">Students can run their code against visible and hidden test cases before final submission.</w:t>
+      </w:r>
+      <w:r>
+        <w:rPr>
+          <w:rtl w:val="0"/>
+        </w:rPr>
+      </w:r>
+    </w:p>
+    <w:p>
+      <w:pPr>
+        <w:numPr>
+          <w:ilvl w:val="0"/>
+          <w:numId w:val="2"/>
+        </w:numPr>
+        <w:spacing w:after="240" w:line="276" w:lineRule="auto"/>
+        <w:ind w:left="720" w:hanging="360"/>
+        <w:jc w:val="both"/>
+        <w:rPr/>
+      </w:pPr>
+      <w:r>
+        <w:rPr>
+          <w:rtl w:val="0"/>
+        </w:rPr>
+        <w:t xml:space="preserve">The editor is fully self-contained with no file system access, no external tools, and no browser access.</w:t>
+      </w:r>
+      <w:r>
+        <w:rPr>
+          <w:rtl w:val="0"/>
+        </w:rPr>
+      </w:r>
+    </w:p>
+    <w:p>
+      <w:pPr>
+        <w:spacing w:after="240" w:line="276" w:lineRule="auto"/>
+        <w:jc w:val="both"/>
+        <w:rPr>
+          <w:b w:val="1"/>
+          <w:bCs w:val="1"/>
+        </w:rPr>
+      </w:pPr>
+      <w:r>
+        <w:rPr>
+          <w:rtl w:val="0"/>
+        </w:rPr>
+      </w:r>
+    </w:p>
+    <w:p>
+      <w:pPr>
+        <w:spacing w:after="240" w:before="240" w:line="276" w:lineRule="auto"/>
+        <w:jc w:val="both"/>
+        <w:rPr>
+          <w:b w:val="1"/>
+          <w:bCs w:val="1"/>
+        </w:rPr>
+      </w:pPr>
+      <w:r>
+        <w:rPr>
+          <w:b w:val="1"/>
+          <w:bCs w:val="1"/>
+          <w:rtl w:val="0"/>
+        </w:rPr>
+        <w:t xml:space="preserve">4. Join by Exam Code and Verification Code</w:t>
+      </w:r>
+    </w:p>
+    <w:p>
+      <w:pPr>
+        <w:numPr>
+          <w:ilvl w:val="0"/>
+          <w:numId w:val="3"/>
+        </w:numPr>
+        <w:ind w:left="720" w:hanging="360"/>
+        <w:rPr/>
+      </w:pPr>
+      <w:r>
+        <w:rPr>
+          <w:rtl w:val="0"/>
+        </w:rPr>
+        <w:t xml:space="preserve">Students join an exam by entering a single-use class code generated by the teacher through the cloud-based exam management system.</w:t>
+      </w:r>
+      <w:r>
+        <w:rPr>
+          <w:rtl w:val="0"/>
+        </w:rPr>
+      </w:r>
+    </w:p>
+    <w:p>
+      <w:pPr>
+        <w:numPr>
+          <w:ilvl w:val="0"/>
+          <w:numId w:val="3"/>
+        </w:numPr>
+        <w:ind w:left="720" w:hanging="360"/>
+        <w:rPr/>
+      </w:pPr>
+      <w:r>
+        <w:rPr>
+          <w:rtl w:val="0"/>
+        </w:rPr>
+        <w:t xml:space="preserve">Students enter a verification code set by the teacher to start the exam.</w:t>
+      </w:r>
+      <w:r>
+        <w:rPr>
+          <w:rtl w:val="0"/>
+        </w:rPr>
+      </w:r>
+    </w:p>
+    <w:p>
+      <w:pPr>
+        <w:numPr>
+          <w:ilvl w:val="0"/>
+          <w:numId w:val="3"/>
+        </w:numPr>
+        <w:ind w:left="720" w:hanging="360"/>
+        <w:rPr/>
+      </w:pPr>
+      <w:r>
+        <w:rPr>
+          <w:rtl w:val="0"/>
+        </w:rPr>
+        <w:t xml:space="preserve">Once the exam ends, the session closes and the class code is invalidated automatically. </w:t>
+      </w:r>
+      <w:r>
+        <w:rPr>
+          <w:rtl w:val="0"/>
+        </w:rPr>
+      </w:r>
+    </w:p>
+    <w:p>
+      <w:pPr>
+        <w:spacing w:after="240" w:before="240" w:line="276" w:lineRule="auto"/>
+        <w:jc w:val="both"/>
+        <w:rPr>
+          <w:b w:val="1"/>
+          <w:bCs w:val="1"/>
+        </w:rPr>
+      </w:pPr>
+      <w:r>
+        <w:rPr>
+          <w:b w:val="1"/>
+          <w:bCs w:val="1"/>
+          <w:rtl w:val="0"/>
+        </w:rPr>
+        <w:t xml:space="preserve">5. Cloud-Based Data Storage and Centralized Management</w:t>
+      </w:r>
+    </w:p>
+    <w:p>
+      <w:pPr>
+        <w:numPr>
+          <w:ilvl w:val="0"/>
           <w:numId w:val="11"/>
         </w:numPr>
-        <w:spacing w:before="240" w:lineRule="auto"/>
-        <w:ind w:left="720" w:hanging="360"/>
-        <w:jc w:val="both"/>
-        <w:rPr/>
-      </w:pPr>
-      <w:r>
-        <w:rPr>
-          <w:rtl w:val="0"/>
-        </w:rPr>
-        <w:t xml:space="preserve">When the teacher starts an exam, lockdown activates simultaneously across all connected student machines.</w:t>
+        <w:spacing w:before="240" w:line="276" w:lineRule="auto"/>
+        <w:ind w:left="720" w:hanging="360"/>
+        <w:jc w:val="both"/>
+        <w:rPr/>
+      </w:pPr>
+      <w:r>
+        <w:rPr>
+          <w:rtl w:val="0"/>
+        </w:rPr>
+        <w:t xml:space="preserve">All exam data, including questions, student answers, scores, violation logs, and exam configurations, is stored in a secure cloud database.</w:t>
       </w:r>
     </w:p>
     <w:p>
@@ -254,420 +940,52 @@
           <w:ilvl w:val="0"/>
           <w:numId w:val="11"/>
         </w:numPr>
-        <w:ind w:left="720" w:hanging="360"/>
-        <w:jc w:val="both"/>
-        <w:rPr/>
-      </w:pPr>
-      <w:r>
-        <w:rPr>
-          <w:rtl w:val="0"/>
-        </w:rPr>
-        <w:t xml:space="preserve">The following are intercepted and suppressed via low-level keyboard hooks: </w:t>
-      </w:r>
-    </w:p>
-    <w:p>
-      <w:pPr>
-        <w:numPr>
-          <w:ilvl w:val="1"/>
+        <w:spacing w:line="276" w:lineRule="auto"/>
+        <w:ind w:left="720" w:hanging="360"/>
+        <w:jc w:val="both"/>
+        <w:rPr/>
+      </w:pPr>
+      <w:r>
+        <w:rPr>
+          <w:rtl w:val="0"/>
+        </w:rPr>
+        <w:t xml:space="preserve">Student responses, progress updates, and assessment results are synchronized.</w:t>
+      </w:r>
+    </w:p>
+    <w:p>
+      <w:pPr>
+        <w:numPr>
+          <w:ilvl w:val="0"/>
           <w:numId w:val="11"/>
         </w:numPr>
-        <w:ind w:left="1440" w:hanging="360"/>
-        <w:jc w:val="both"/>
-        <w:rPr/>
-      </w:pPr>
-      <w:r>
-        <w:rPr>
-          <w:rtl w:val="0"/>
-        </w:rPr>
-        <w:t xml:space="preserve">Alt+Tab and all application-switching shortcuts</w:t>
-      </w:r>
-    </w:p>
-    <w:p>
-      <w:pPr>
-        <w:numPr>
-          <w:ilvl w:val="1"/>
+        <w:spacing w:line="276" w:lineRule="auto"/>
+        <w:ind w:left="720" w:hanging="360"/>
+        <w:jc w:val="both"/>
+        <w:rPr/>
+      </w:pPr>
+      <w:r>
+        <w:rPr>
+          <w:rtl w:val="0"/>
+        </w:rPr>
+        <w:t xml:space="preserve">Data remains available after the exam ends and can be reviewed, exported, or reused for future assessments.</w:t>
+      </w:r>
+    </w:p>
+    <w:p>
+      <w:pPr>
+        <w:numPr>
+          <w:ilvl w:val="0"/>
           <w:numId w:val="11"/>
         </w:numPr>
-        <w:ind w:left="1440" w:hanging="360"/>
-        <w:jc w:val="both"/>
-        <w:rPr/>
-      </w:pPr>
-      <w:r>
-        <w:rPr>
-          <w:rtl w:val="0"/>
-        </w:rPr>
-        <w:t xml:space="preserve">The Windows key and Start menu</w:t>
-      </w:r>
-    </w:p>
-    <w:p>
-      <w:pPr>
-        <w:numPr>
-          <w:ilvl w:val="1"/>
-          <w:numId w:val="11"/>
-        </w:numPr>
-        <w:ind w:left="1440" w:hanging="360"/>
-        <w:jc w:val="both"/>
-        <w:rPr/>
-      </w:pPr>
-      <w:r>
-        <w:rPr>
-          <w:rtl w:val="0"/>
-        </w:rPr>
-        <w:t xml:space="preserve">Task Manager (Ctrl+Shift+Esc and Ctrl+Alt+Del handling)</w:t>
-      </w:r>
-    </w:p>
-    <w:p>
-      <w:pPr>
-        <w:numPr>
-          <w:ilvl w:val="1"/>
-          <w:numId w:val="11"/>
-        </w:numPr>
-        <w:ind w:left="1440" w:hanging="360"/>
-        <w:jc w:val="both"/>
-        <w:rPr/>
-      </w:pPr>
-      <w:r>
-        <w:rPr>
-          <w:rtl w:val="0"/>
-        </w:rPr>
-        <w:t xml:space="preserve">Copy-paste shortcuts (Ctrl+C, Ctrl+V, Ctrl+X)</w:t>
-      </w:r>
-    </w:p>
-    <w:p>
-      <w:pPr>
-        <w:numPr>
-          <w:ilvl w:val="1"/>
-          <w:numId w:val="11"/>
-        </w:numPr>
-        <w:ind w:left="1440" w:hanging="360"/>
-        <w:jc w:val="both"/>
-        <w:rPr/>
-      </w:pPr>
-      <w:r>
-        <w:rPr>
-          <w:rtl w:val="0"/>
-        </w:rPr>
-        <w:t xml:space="preserve">Screenshot tools (PrintScreen, Win+Shift+S)</w:t>
-      </w:r>
-    </w:p>
-    <w:p>
-      <w:pPr>
-        <w:numPr>
-          <w:ilvl w:val="0"/>
-          <w:numId w:val="11"/>
-        </w:numPr>
-        <w:ind w:left="720" w:hanging="360"/>
-        <w:jc w:val="both"/>
-        <w:rPr/>
-      </w:pPr>
-      <w:r>
-        <w:rPr>
-          <w:rtl w:val="0"/>
-        </w:rPr>
-        <w:t xml:space="preserve">A fullscreen, always-on-top kiosk window captures focus so no background application can receive input .</w:t>
-      </w:r>
-    </w:p>
-    <w:p>
-      <w:pPr>
-        <w:numPr>
-          <w:ilvl w:val="0"/>
-          <w:numId w:val="11"/>
-        </w:numPr>
-        <w:ind w:left="720" w:hanging="360"/>
-        <w:jc w:val="both"/>
-        <w:rPr/>
-      </w:pPr>
-      <w:r>
-        <w:rPr>
-          <w:rtl w:val="0"/>
-        </w:rPr>
-        <w:t xml:space="preserve">Active process monitoring detects and flags any attempt to open disallowed applications</w:t>
-      </w:r>
-    </w:p>
-    <w:p>
-      <w:pPr>
-        <w:numPr>
-          <w:ilvl w:val="0"/>
-          <w:numId w:val="11"/>
-        </w:numPr>
-        <w:ind w:left="720" w:hanging="360"/>
-        <w:jc w:val="both"/>
-        <w:rPr/>
-      </w:pPr>
-      <w:r>
-        <w:rPr>
-          <w:rtl w:val="0"/>
-        </w:rPr>
-        <w:t xml:space="preserve">Any bypass attempt is silently logged with a timestamp and flagged immediately on the teacher dashboard.</w:t>
-      </w:r>
-    </w:p>
-    <w:p>
-      <w:pPr>
-        <w:numPr>
-          <w:ilvl w:val="0"/>
-          <w:numId w:val="15"/>
-        </w:numPr>
-        <w:ind w:left="720" w:hanging="360"/>
-        <w:rPr/>
-      </w:pPr>
-      <w:r>
-        <w:rPr>
-          <w:rtl w:val="0"/>
-        </w:rPr>
-        <w:t xml:space="preserve">The system records and monitors student keystroke activity during the examination session for audit and behavioral review.</w:t>
-      </w:r>
-    </w:p>
-    <w:p>
-      <w:pPr>
-        <w:numPr>
-          <w:ilvl w:val="0"/>
-          <w:numId w:val="15"/>
-        </w:numPr>
-        <w:ind w:left="720" w:hanging="360"/>
-        <w:rPr/>
-      </w:pPr>
-      <w:r>
-        <w:rPr>
-          <w:rtl w:val="0"/>
-        </w:rPr>
-        <w:t xml:space="preserve">Keystroke logs are timestamped and associated with specific question interactions.</w:t>
-      </w:r>
-    </w:p>
-    <w:p>
-      <w:pPr>
-        <w:numPr>
-          <w:ilvl w:val="0"/>
-          <w:numId w:val="15"/>
-        </w:numPr>
-        <w:ind w:left="720" w:hanging="360"/>
-        <w:rPr/>
-      </w:pPr>
-      <w:r>
-        <w:rPr>
-          <w:rtl w:val="0"/>
-        </w:rPr>
-        <w:t xml:space="preserve">Keystroke monitoring applies only during an exam session inside the CodeLit application and is used for academic integrity investigation and incident reporting.</w:t>
-      </w:r>
-    </w:p>
-    <w:p>
-      <w:pPr>
-        <w:numPr>
-          <w:ilvl w:val="0"/>
-          <w:numId w:val="11"/>
-        </w:numPr>
-        <w:ind w:left="720" w:hanging="360"/>
-        <w:jc w:val="both"/>
-        <w:rPr/>
-      </w:pPr>
-      <w:r>
-        <w:rPr>
-          <w:rtl w:val="0"/>
-        </w:rPr>
-        <w:t xml:space="preserve">Lockdown is lifted when the teacher explicitly ends the exam session or code exit.</w:t>
-      </w:r>
-    </w:p>
-    <w:p>
-      <w:pPr>
-        <w:numPr>
-          <w:ilvl w:val="0"/>
-          <w:numId w:val="11"/>
-        </w:numPr>
-        <w:spacing w:after="240" w:lineRule="auto"/>
-        <w:ind w:left="720" w:hanging="360"/>
-        <w:jc w:val="both"/>
-        <w:rPr/>
-      </w:pPr>
-      <w:r>
-        <w:rPr>
-          <w:rtl w:val="0"/>
-        </w:rPr>
-        <w:t xml:space="preserve">Upon launching the application, the system automatically closes all non-essential applications and mutes system audio before the student can access any exam, activity, or assignment.</w:t>
-      </w:r>
-    </w:p>
-    <w:p>
-      <w:pPr>
-        <w:spacing w:after="240" w:before="240" w:lineRule="auto"/>
-        <w:jc w:val="both"/>
-        <w:rPr>
-          <w:b w:val="1"/>
-          <w:bCs w:val="1"/>
-        </w:rPr>
-      </w:pPr>
-      <w:r>
-        <w:rPr>
-          <w:b w:val="1"/>
-          <w:bCs w:val="1"/>
-          <w:rtl w:val="0"/>
-        </w:rPr>
-        <w:t xml:space="preserve">2. Local Code Compiler and Automated Assessment Engine </w:t>
-      </w:r>
-    </w:p>
-    <w:p>
-      <w:pPr>
-        <w:spacing w:after="240" w:before="240" w:lineRule="auto"/>
-        <w:jc w:val="both"/>
-        <w:rPr/>
-      </w:pPr>
-      <w:r>
-        <w:rPr>
-          <w:rtl w:val="0"/>
-        </w:rPr>
-        <w:t xml:space="preserve">The platform runs its own code execution engine locally. No external grading API or internet connection is involved.</w:t>
-      </w:r>
-    </w:p>
-    <w:p>
-      <w:pPr>
-        <w:numPr>
-          <w:ilvl w:val="0"/>
-          <w:numId w:val="14"/>
-        </w:numPr>
-        <w:spacing w:before="240" w:lineRule="auto"/>
-        <w:ind w:left="720" w:hanging="360"/>
-        <w:jc w:val="both"/>
-        <w:rPr/>
-      </w:pPr>
-      <w:r>
-        <w:rPr>
-          <w:rtl w:val="0"/>
-        </w:rPr>
-        <w:t xml:space="preserve">Supports C using compiler and runtime tools pre-installed on the host machine (GCC for C).</w:t>
-      </w:r>
-    </w:p>
-    <w:p>
-      <w:pPr>
-        <w:numPr>
-          <w:ilvl w:val="0"/>
-          <w:numId w:val="14"/>
-        </w:numPr>
-        <w:ind w:left="720" w:hanging="360"/>
-        <w:jc w:val="both"/>
-        <w:rPr/>
-      </w:pPr>
-      <w:r>
-        <w:rPr>
-          <w:rtl w:val="0"/>
-        </w:rPr>
-        <w:t xml:space="preserve">Students may check their code against the assessment engine before final submission.</w:t>
-      </w:r>
-    </w:p>
-    <w:p>
-      <w:pPr>
-        <w:numPr>
-          <w:ilvl w:val="0"/>
-          <w:numId w:val="14"/>
-        </w:numPr>
-        <w:ind w:left="720" w:hanging="360"/>
-        <w:jc w:val="both"/>
-        <w:rPr/>
-      </w:pPr>
-      <w:r>
-        <w:rPr>
-          <w:rtl w:val="0"/>
-        </w:rPr>
-        <w:t xml:space="preserve">Each code check attempt incurs a teacher-configurable point deduction to discourage excessive trial-and-error submissions and encourage problem-solving before verification. </w:t>
-      </w:r>
-    </w:p>
-    <w:p>
-      <w:pPr>
-        <w:numPr>
-          <w:ilvl w:val="0"/>
-          <w:numId w:val="14"/>
-        </w:numPr>
-        <w:ind w:left="720" w:hanging="360"/>
-        <w:jc w:val="both"/>
-        <w:rPr/>
-      </w:pPr>
-      <w:r>
-        <w:rPr>
-          <w:rtl w:val="0"/>
-        </w:rPr>
-        <w:t xml:space="preserve">The system records the number of code check attempts made by each student during the examination. </w:t>
-      </w:r>
-    </w:p>
-    <w:p>
-      <w:pPr>
-        <w:numPr>
-          <w:ilvl w:val="0"/>
-          <w:numId w:val="14"/>
-        </w:numPr>
-        <w:ind w:left="720" w:hanging="360"/>
-        <w:jc w:val="both"/>
-        <w:rPr/>
-      </w:pPr>
-      <w:r>
-        <w:rPr>
-          <w:rtl w:val="0"/>
-        </w:rPr>
-        <w:t xml:space="preserve">Final scores for coding questions are automatically adjusted based on the configured deduction rules and the student's total number of code check attempts. </w:t>
-      </w:r>
-    </w:p>
-    <w:p>
-      <w:pPr>
-        <w:numPr>
-          <w:ilvl w:val="0"/>
-          <w:numId w:val="14"/>
-        </w:numPr>
-        <w:ind w:left="720" w:hanging="360"/>
-        <w:jc w:val="both"/>
-        <w:rPr/>
-      </w:pPr>
-      <w:r>
-        <w:rPr>
-          <w:rtl w:val="0"/>
-        </w:rPr>
-        <w:t xml:space="preserve">On submission, the engine compiles the student's code, runs it against hidden teacher-defined test cases, compares output, and returns a pass/fail result with partial credit scoring.</w:t>
-      </w:r>
-    </w:p>
-    <w:p>
-      <w:pPr>
-        <w:numPr>
-          <w:ilvl w:val="0"/>
-          <w:numId w:val="14"/>
-        </w:numPr>
-        <w:ind w:left="720" w:hanging="360"/>
-        <w:jc w:val="both"/>
-        <w:rPr/>
-      </w:pPr>
-      <w:r>
-        <w:rPr>
-          <w:rtl w:val="0"/>
-        </w:rPr>
-        <w:t xml:space="preserve">Each execution runs in process isolation with a configurable time limit and automatic temporary file cleanup.</w:t>
-      </w:r>
-    </w:p>
-    <w:p>
-      <w:pPr>
-        <w:numPr>
-          <w:ilvl w:val="0"/>
-          <w:numId w:val="14"/>
-        </w:numPr>
-        <w:ind w:left="720" w:hanging="360"/>
-        <w:jc w:val="both"/>
-        <w:rPr/>
-      </w:pPr>
-      <w:r>
-        <w:rPr>
-          <w:rtl w:val="0"/>
-        </w:rPr>
-        <w:t xml:space="preserve">One student's submission cannot affect another's execution environment.</w:t>
-      </w:r>
-    </w:p>
-    <w:p>
-      <w:pPr>
-        <w:spacing w:after="240" w:before="240" w:lineRule="auto"/>
-        <w:jc w:val="both"/>
-        <w:rPr>
-          <w:b w:val="1"/>
-          <w:bCs w:val="1"/>
-        </w:rPr>
-      </w:pPr>
-      <w:r>
-        <w:rPr>
-          <w:b w:val="1"/>
-          <w:bCs w:val="1"/>
-          <w:rtl w:val="0"/>
-        </w:rPr>
-        <w:t xml:space="preserve">3. In-App Code Editor for Students</w:t>
+        <w:spacing w:line="276" w:lineRule="auto"/>
+        <w:ind w:left="720" w:hanging="360"/>
+        <w:jc w:val="both"/>
+        <w:rPr/>
+      </w:pPr>
+      <w:r>
+        <w:rPr>
+          <w:rtl w:val="0"/>
+        </w:rPr>
+        <w:t xml:space="preserve">The platform maintains centralized ownership and management of examination records while reducing dependence on local machine storage.</w:t>
       </w:r>
     </w:p>
     <w:p>
@@ -676,16 +994,15 @@
           <w:ilvl w:val="0"/>
           <w:numId w:val="4"/>
         </w:numPr>
-        <w:spacing w:before="240" w:lineRule="auto"/>
-        <w:ind w:left="720" w:hanging="360"/>
-        <w:jc w:val="both"/>
-        <w:rPr/>
-      </w:pPr>
-      <w:r>
-        <w:rPr>
-          <w:rtl w:val="0"/>
-        </w:rPr>
-        <w:t xml:space="preserve">Students write and run code inside a built-in Monaco editor (the same engine powering Visual Studio Code) rendered within the locked application window.</w:t>
+        <w:spacing w:line="276" w:lineRule="auto"/>
+        <w:ind w:left="720" w:hanging="360"/>
+        <w:rPr/>
+      </w:pPr>
+      <w:r>
+        <w:rPr>
+          <w:rtl w:val="0"/>
+        </w:rPr>
+        <w:t xml:space="preserve">If the student's internet connection is temporarily interrupted during an active examination, the system automatically stores in-progress answers, code drafts, and unsynchronized actions locally using SQLite as a fallback mechanism.</w:t>
       </w:r>
     </w:p>
     <w:p>
@@ -694,15 +1011,15 @@
           <w:ilvl w:val="0"/>
           <w:numId w:val="4"/>
         </w:numPr>
-        <w:ind w:left="720" w:hanging="360"/>
-        <w:jc w:val="both"/>
-        <w:rPr/>
-      </w:pPr>
-      <w:r>
-        <w:rPr>
-          <w:rtl w:val="0"/>
-        </w:rPr>
-        <w:t xml:space="preserve">Students can run their code against visible sample test cases before final submission.</w:t>
+        <w:spacing w:line="276" w:lineRule="auto"/>
+        <w:ind w:left="720" w:hanging="360"/>
+        <w:rPr/>
+      </w:pPr>
+      <w:r>
+        <w:rPr>
+          <w:rtl w:val="0"/>
+        </w:rPr>
+        <w:t xml:space="preserve">Once connectivity is restored, locally stored data is automatically synchronized with the cloud database to maintain data consistency.</w:t>
       </w:r>
     </w:p>
     <w:p>
@@ -711,157 +1028,33 @@
           <w:ilvl w:val="0"/>
           <w:numId w:val="4"/>
         </w:numPr>
-        <w:spacing w:after="240" w:lineRule="auto"/>
-        <w:ind w:left="720" w:hanging="360"/>
-        <w:jc w:val="both"/>
-        <w:rPr/>
-      </w:pPr>
-      <w:r>
-        <w:rPr>
-          <w:rtl w:val="0"/>
-        </w:rPr>
-        <w:t xml:space="preserve">The editor is fully self-contained with no file system access, no external tools, and no browser access.</w:t>
-      </w:r>
-    </w:p>
-    <w:p>
-      <w:pPr>
-        <w:spacing w:after="240" w:before="240" w:lineRule="auto"/>
-        <w:jc w:val="both"/>
-        <w:rPr>
-          <w:b w:val="1"/>
-          <w:bCs w:val="1"/>
-        </w:rPr>
-      </w:pPr>
-      <w:r>
-        <w:rPr>
-          <w:b w:val="1"/>
-          <w:bCs w:val="1"/>
-          <w:rtl w:val="0"/>
-        </w:rPr>
-        <w:t xml:space="preserve">4. Join by Exam Code</w:t>
-      </w:r>
-    </w:p>
-    <w:p>
-      <w:pPr>
-        <w:numPr>
-          <w:ilvl w:val="0"/>
-          <w:numId w:val="12"/>
-        </w:numPr>
-        <w:spacing w:before="240" w:lineRule="auto"/>
-        <w:ind w:left="720" w:hanging="360"/>
-        <w:jc w:val="both"/>
-        <w:rPr/>
-      </w:pPr>
-      <w:r>
-        <w:rPr>
-          <w:rtl w:val="0"/>
-        </w:rPr>
-        <w:t xml:space="preserve">Students join an exam by entering a single-use class code generated by the teacher through the cloud-based exam management system. </w:t>
-      </w:r>
-    </w:p>
-    <w:p>
-      <w:pPr>
-        <w:numPr>
-          <w:ilvl w:val="0"/>
-          <w:numId w:val="12"/>
-        </w:numPr>
-        <w:spacing w:after="240" w:lineRule="auto"/>
-        <w:ind w:left="720" w:hanging="360"/>
-        <w:jc w:val="both"/>
-        <w:rPr/>
-      </w:pPr>
-      <w:r>
-        <w:rPr>
-          <w:rtl w:val="0"/>
-        </w:rPr>
-        <w:t xml:space="preserve">Once the exam ends, the session closes and the class code is invalidated automatically.</w:t>
-      </w:r>
-    </w:p>
-    <w:p>
-      <w:pPr>
-        <w:spacing w:after="240" w:before="240" w:lineRule="auto"/>
-        <w:jc w:val="both"/>
-        <w:rPr>
-          <w:b w:val="1"/>
-          <w:bCs w:val="1"/>
-        </w:rPr>
-      </w:pPr>
-      <w:r>
-        <w:rPr>
-          <w:b w:val="1"/>
-          <w:bCs w:val="1"/>
-          <w:rtl w:val="0"/>
-        </w:rPr>
-        <w:t xml:space="preserve">5. Cloud-Based Data Storage and Centralized Management</w:t>
-      </w:r>
-    </w:p>
-    <w:p>
-      <w:pPr>
-        <w:numPr>
-          <w:ilvl w:val="0"/>
-          <w:numId w:val="9"/>
-        </w:numPr>
-        <w:spacing w:before="240" w:lineRule="auto"/>
-        <w:ind w:left="720" w:hanging="360"/>
-        <w:jc w:val="both"/>
-        <w:rPr/>
-      </w:pPr>
-      <w:r>
-        <w:rPr>
-          <w:rtl w:val="0"/>
-        </w:rPr>
-        <w:t xml:space="preserve">All exam data, including questions, student answers, scores, violation logs, and exam configurations, is stored in a secure cloud database.</w:t>
-      </w:r>
-    </w:p>
-    <w:p>
-      <w:pPr>
-        <w:numPr>
-          <w:ilvl w:val="0"/>
-          <w:numId w:val="9"/>
-        </w:numPr>
-        <w:ind w:left="720" w:hanging="360"/>
-        <w:jc w:val="both"/>
-        <w:rPr/>
-      </w:pPr>
-      <w:r>
-        <w:rPr>
-          <w:rtl w:val="0"/>
-        </w:rPr>
-        <w:t xml:space="preserve">Student responses, progress updates, and assessment results are synchronized.</w:t>
-      </w:r>
-    </w:p>
-    <w:p>
-      <w:pPr>
-        <w:numPr>
-          <w:ilvl w:val="0"/>
-          <w:numId w:val="9"/>
-        </w:numPr>
-        <w:ind w:left="720" w:hanging="360"/>
-        <w:jc w:val="both"/>
-        <w:rPr/>
-      </w:pPr>
-      <w:r>
-        <w:rPr>
-          <w:rtl w:val="0"/>
-        </w:rPr>
-        <w:t xml:space="preserve">Data remains available after the exam ends and can be reviewed, exported, or reused for future assessments.</w:t>
-      </w:r>
-    </w:p>
-    <w:p>
-      <w:pPr>
-        <w:numPr>
-          <w:ilvl w:val="0"/>
-          <w:numId w:val="9"/>
-        </w:numPr>
-        <w:ind w:left="720" w:hanging="360"/>
-        <w:jc w:val="both"/>
-        <w:rPr/>
-      </w:pPr>
-      <w:r>
-        <w:rPr>
-          <w:rtl w:val="0"/>
-        </w:rPr>
-        <w:t xml:space="preserve">The platform maintains centralized ownership and management of examination records while reducing dependence on local machine storage.</w:t>
+        <w:spacing w:after="240" w:line="276" w:lineRule="auto"/>
+        <w:ind w:left="720" w:hanging="360"/>
+        <w:rPr/>
+      </w:pPr>
+      <w:r>
+        <w:rPr>
+          <w:rtl w:val="0"/>
+        </w:rPr>
+        <w:t xml:space="preserve">This fallback ensures that temporary connection loss does not result in data loss or interrupted exam progress.</w:t>
+      </w:r>
+    </w:p>
+    <w:p>
+      <w:pPr>
+        <w:spacing w:after="240" w:before="240" w:line="276" w:lineRule="auto"/>
+        <w:jc w:val="both"/>
+        <w:rPr>
+          <w:b w:val="1"/>
+          <w:bCs w:val="1"/>
+        </w:rPr>
+      </w:pPr>
+      <w:r>
+        <w:rPr>
+          <w:b w:val="1"/>
+          <w:bCs w:val="1"/>
+          <w:rtl w:val="0"/>
+        </w:rPr>
+        <w:t xml:space="preserve">6. Cloud-Based Synchronization </w:t>
       </w:r>
     </w:p>
     <w:p>
@@ -870,14 +1063,16 @@
           <w:ilvl w:val="0"/>
           <w:numId w:val="7"/>
         </w:numPr>
-        <w:ind w:left="720" w:hanging="360"/>
-        <w:rPr/>
-      </w:pPr>
-      <w:r>
-        <w:rPr>
-          <w:rtl w:val="0"/>
-        </w:rPr>
-        <w:t xml:space="preserve">If the student's internet connection is temporarily interrupted during an active examination, the system automatically stores in-progress answers, code drafts, and unsynchronized actions locally using SQLite as a fallback mechanism.</w:t>
+        <w:spacing w:before="240" w:line="276" w:lineRule="auto"/>
+        <w:ind w:left="720" w:hanging="360"/>
+        <w:jc w:val="both"/>
+        <w:rPr/>
+      </w:pPr>
+      <w:r>
+        <w:rPr>
+          <w:rtl w:val="0"/>
+        </w:rPr>
+        <w:t xml:space="preserve">The platform uses cloud-hosted communication services to synchronize exam activities across all connected devices.</w:t>
       </w:r>
     </w:p>
     <w:p>
@@ -886,89 +1081,33 @@
           <w:ilvl w:val="0"/>
           <w:numId w:val="7"/>
         </w:numPr>
-        <w:ind w:left="720" w:hanging="360"/>
-        <w:rPr/>
-      </w:pPr>
-      <w:r>
-        <w:rPr>
-          <w:rtl w:val="0"/>
-        </w:rPr>
-        <w:t xml:space="preserve">Once connectivity is restored, locally stored data is automatically synchronized with the cloud database to maintain data consistency.</w:t>
-      </w:r>
-    </w:p>
-    <w:p>
-      <w:pPr>
-        <w:numPr>
-          <w:ilvl w:val="0"/>
-          <w:numId w:val="7"/>
-        </w:numPr>
-        <w:spacing w:after="240" w:lineRule="auto"/>
-        <w:ind w:left="720" w:hanging="360"/>
-        <w:rPr/>
-      </w:pPr>
-      <w:r>
-        <w:rPr>
-          <w:rtl w:val="0"/>
-        </w:rPr>
-        <w:t xml:space="preserve">This fallback ensures that temporary connection loss does not result in data loss or interrupted exam progress.</w:t>
-      </w:r>
-    </w:p>
-    <w:p>
-      <w:pPr>
-        <w:spacing w:after="240" w:before="240" w:lineRule="auto"/>
-        <w:jc w:val="both"/>
-        <w:rPr>
-          <w:b w:val="1"/>
-          <w:bCs w:val="1"/>
-        </w:rPr>
-      </w:pPr>
-      <w:r>
-        <w:rPr>
-          <w:b w:val="1"/>
-          <w:bCs w:val="1"/>
-          <w:rtl w:val="0"/>
-        </w:rPr>
-        <w:t xml:space="preserve">6. Cloud-Based Synchronization </w:t>
-      </w:r>
-    </w:p>
-    <w:p>
-      <w:pPr>
-        <w:numPr>
-          <w:ilvl w:val="0"/>
-          <w:numId w:val="2"/>
-        </w:numPr>
-        <w:spacing w:before="240" w:lineRule="auto"/>
-        <w:ind w:left="720" w:hanging="360"/>
-        <w:jc w:val="both"/>
-        <w:rPr/>
-      </w:pPr>
-      <w:r>
-        <w:rPr>
-          <w:rtl w:val="0"/>
-        </w:rPr>
-        <w:t xml:space="preserve">The platform uses cloud-hosted communication services to synchronize exam activities across all connected devices.</w:t>
-      </w:r>
-    </w:p>
-    <w:p>
-      <w:pPr>
-        <w:numPr>
-          <w:ilvl w:val="0"/>
-          <w:numId w:val="2"/>
-        </w:numPr>
-        <w:ind w:left="720" w:hanging="360"/>
-        <w:jc w:val="both"/>
-        <w:rPr/>
-      </w:pPr>
-      <w:r>
-        <w:rPr>
-          <w:rtl w:val="0"/>
-        </w:rPr>
-        <w:t xml:space="preserve">Local code compilation and assessment occur on the student machine, while synchronization and result reporting are handled through the cloud. </w:t>
-      </w:r>
-    </w:p>
-    <w:p>
-      <w:pPr>
-        <w:spacing w:after="240" w:before="240" w:lineRule="auto"/>
+        <w:spacing w:line="276" w:lineRule="auto"/>
+        <w:ind w:left="720" w:hanging="360"/>
+        <w:jc w:val="both"/>
+        <w:rPr/>
+      </w:pPr>
+      <w:r>
+        <w:rPr>
+          <w:rtl w:val="0"/>
+        </w:rPr>
+        <w:t xml:space="preserve">Local code compilation</w:t>
+      </w:r>
+      <w:r>
+        <w:rPr>
+          <w:rtl w:val="0"/>
+        </w:rPr>
+        <w:t xml:space="preserve"> and assessment </w:t>
+      </w:r>
+      <w:r>
+        <w:rPr>
+          <w:rtl w:val="0"/>
+        </w:rPr>
+        <w:t xml:space="preserve">occur on the student machine, while synchronization and result reporting are handled through the cloud.</w:t>
+      </w:r>
+    </w:p>
+    <w:p>
+      <w:pPr>
+        <w:spacing w:after="240" w:before="240" w:line="276" w:lineRule="auto"/>
         <w:jc w:val="both"/>
         <w:rPr>
           <w:b w:val="1"/>
@@ -988,9 +1127,9 @@
       <w:pPr>
         <w:numPr>
           <w:ilvl w:val="0"/>
-          <w:numId w:val="8"/>
-        </w:numPr>
-        <w:spacing w:before="240" w:lineRule="auto"/>
+          <w:numId w:val="1"/>
+        </w:numPr>
+        <w:spacing w:before="240" w:line="276" w:lineRule="auto"/>
         <w:ind w:left="720" w:hanging="360"/>
         <w:jc w:val="both"/>
         <w:rPr/>
@@ -1006,8 +1145,9 @@
       <w:pPr>
         <w:numPr>
           <w:ilvl w:val="0"/>
-          <w:numId w:val="8"/>
-        </w:numPr>
+          <w:numId w:val="1"/>
+        </w:numPr>
+        <w:spacing w:line="276" w:lineRule="auto"/>
         <w:ind w:left="720" w:hanging="360"/>
         <w:jc w:val="both"/>
         <w:rPr/>
@@ -1023,8 +1163,9 @@
       <w:pPr>
         <w:numPr>
           <w:ilvl w:val="0"/>
-          <w:numId w:val="8"/>
-        </w:numPr>
+          <w:numId w:val="1"/>
+        </w:numPr>
+        <w:spacing w:line="276" w:lineRule="auto"/>
         <w:ind w:left="720" w:hanging="360"/>
         <w:jc w:val="both"/>
         <w:rPr/>
@@ -1040,8 +1181,9 @@
       <w:pPr>
         <w:numPr>
           <w:ilvl w:val="0"/>
-          <w:numId w:val="8"/>
-        </w:numPr>
+          <w:numId w:val="1"/>
+        </w:numPr>
+        <w:spacing w:line="276" w:lineRule="auto"/>
         <w:ind w:left="720" w:hanging="360"/>
         <w:jc w:val="both"/>
         <w:rPr/>
@@ -1057,8 +1199,9 @@
       <w:pPr>
         <w:numPr>
           <w:ilvl w:val="0"/>
-          <w:numId w:val="8"/>
-        </w:numPr>
+          <w:numId w:val="1"/>
+        </w:numPr>
+        <w:spacing w:line="276" w:lineRule="auto"/>
         <w:ind w:left="720" w:hanging="360"/>
         <w:jc w:val="both"/>
         <w:rPr/>
@@ -1074,9 +1217,9 @@
       <w:pPr>
         <w:numPr>
           <w:ilvl w:val="0"/>
-          <w:numId w:val="8"/>
-        </w:numPr>
-        <w:spacing w:after="240" w:lineRule="auto"/>
+          <w:numId w:val="1"/>
+        </w:numPr>
+        <w:spacing w:after="240" w:line="276" w:lineRule="auto"/>
         <w:ind w:left="720" w:hanging="360"/>
         <w:jc w:val="both"/>
         <w:rPr/>
@@ -1090,6 +1233,7 @@
     </w:p>
     <w:p>
       <w:pPr>
+        <w:spacing w:line="276" w:lineRule="auto"/>
         <w:rPr>
           <w:b w:val="1"/>
           <w:bCs w:val="1"/>
@@ -1110,7 +1254,7 @@
     </w:p>
     <w:p>
       <w:pPr>
-        <w:spacing w:after="240" w:before="240" w:lineRule="auto"/>
+        <w:spacing w:after="240" w:before="240" w:line="276" w:lineRule="auto"/>
         <w:jc w:val="both"/>
         <w:rPr>
           <w:b w:val="1"/>
@@ -1128,7 +1272,7 @@
     </w:p>
     <w:p>
       <w:pPr>
-        <w:spacing w:after="240" w:before="240" w:lineRule="auto"/>
+        <w:spacing w:after="240" w:before="240" w:line="276" w:lineRule="auto"/>
         <w:jc w:val="both"/>
         <w:rPr/>
       </w:pPr>
@@ -1143,18 +1287,616 @@
       <w:pPr>
         <w:numPr>
           <w:ilvl w:val="0"/>
+          <w:numId w:val="6"/>
+        </w:numPr>
+        <w:spacing w:before="240" w:line="276" w:lineRule="auto"/>
+        <w:ind w:left="720" w:hanging="360"/>
+        <w:jc w:val="both"/>
+        <w:rPr/>
+      </w:pPr>
+      <w:r>
+        <w:rPr>
+          <w:rtl w:val="0"/>
+        </w:rPr>
+        <w:t xml:space="preserve">Displays all connected students, their current question, and their progress status.</w:t>
+      </w:r>
+    </w:p>
+    <w:p>
+      <w:pPr>
+        <w:numPr>
+          <w:ilvl w:val="0"/>
+          <w:numId w:val="6"/>
+        </w:numPr>
+        <w:spacing w:line="276" w:lineRule="auto"/>
+        <w:ind w:left="720" w:hanging="360"/>
+        <w:jc w:val="both"/>
+        <w:rPr/>
+      </w:pPr>
+      <w:r>
+        <w:rPr>
+          <w:rtl w:val="0"/>
+        </w:rPr>
+        <w:t xml:space="preserve">Violation alerts appear instantly showing the student name, violation type, and exact timestamp.</w:t>
+      </w:r>
+      <w:r>
+        <w:rPr>
+          <w:rtl w:val="0"/>
+        </w:rPr>
+      </w:r>
+    </w:p>
+    <w:p>
+      <w:pPr>
+        <w:numPr>
+          <w:ilvl w:val="0"/>
+          <w:numId w:val="6"/>
+        </w:numPr>
+        <w:spacing w:line="276" w:lineRule="auto"/>
+        <w:ind w:left="720" w:hanging="360"/>
+        <w:jc w:val="both"/>
+        <w:rPr/>
+      </w:pPr>
+      <w:r>
+        <w:rPr>
+          <w:rtl w:val="0"/>
+        </w:rPr>
+        <w:t xml:space="preserve">Teachers can end the entire exam session </w:t>
+      </w:r>
+      <w:r>
+        <w:rPr>
+          <w:rtl w:val="0"/>
+        </w:rPr>
+        <w:t xml:space="preserve"> or remove a specific student directly from the dashboard.</w:t>
+      </w:r>
+    </w:p>
+    <w:p>
+      <w:pPr>
+        <w:numPr>
+          <w:ilvl w:val="0"/>
+          <w:numId w:val="6"/>
+        </w:numPr>
+        <w:spacing w:line="276" w:lineRule="auto"/>
+        <w:ind w:left="720" w:hanging="360"/>
+        <w:jc w:val="both"/>
+        <w:rPr/>
+      </w:pPr>
+      <w:r>
+        <w:rPr>
+          <w:rtl w:val="0"/>
+        </w:rPr>
+        <w:t xml:space="preserve">Student movement tracker logs every action taken during the exam, including question navigation, focus changes, and submission events.</w:t>
+      </w:r>
+    </w:p>
+    <w:p>
+      <w:pPr>
+        <w:numPr>
+          <w:ilvl w:val="0"/>
+          <w:numId w:val="6"/>
+        </w:numPr>
+        <w:spacing w:line="276" w:lineRule="auto"/>
+        <w:ind w:left="720" w:hanging="360"/>
+        <w:jc w:val="both"/>
+        <w:rPr/>
+      </w:pPr>
+      <w:r>
+        <w:rPr>
+          <w:rtl w:val="0"/>
+        </w:rPr>
+        <w:t xml:space="preserve">Score analytics are displayed after the exam, including per-student breakdowns and question-level performance.</w:t>
+      </w:r>
+    </w:p>
+    <w:p>
+      <w:pPr>
+        <w:numPr>
+          <w:ilvl w:val="0"/>
+          <w:numId w:val="6"/>
+        </w:numPr>
+        <w:spacing w:line="276" w:lineRule="auto"/>
+        <w:ind w:left="720" w:hanging="360"/>
+        <w:jc w:val="both"/>
+        <w:rPr/>
+      </w:pPr>
+      <w:r>
+        <w:rPr>
+          <w:rtl w:val="0"/>
+        </w:rPr>
+        <w:t xml:space="preserve">Teachers can access and manage exams through their accounts from any authorized device with an internet connection.</w:t>
+      </w:r>
+    </w:p>
+    <w:p>
+      <w:pPr>
+        <w:spacing w:after="240" w:before="240" w:line="276" w:lineRule="auto"/>
+        <w:jc w:val="both"/>
+        <w:rPr>
+          <w:b w:val="1"/>
+          <w:bCs w:val="1"/>
+        </w:rPr>
+      </w:pPr>
+      <w:r>
+        <w:rPr>
+          <w:b w:val="1"/>
+          <w:bCs w:val="1"/>
+          <w:rtl w:val="0"/>
+        </w:rPr>
+        <w:t xml:space="preserve">2. Multi-Type Exam Builder </w:t>
+      </w:r>
+    </w:p>
+    <w:p>
+      <w:pPr>
+        <w:spacing w:after="240" w:before="240" w:line="276" w:lineRule="auto"/>
+        <w:jc w:val="both"/>
+        <w:rPr/>
+      </w:pPr>
+      <w:r>
+        <w:rPr>
+          <w:rtl w:val="0"/>
+        </w:rPr>
+        <w:t xml:space="preserve">Teachers build exams entirely through the web-based teacher portal. A single exam can combine any mix of the following question types:</w:t>
+      </w:r>
+    </w:p>
+    <w:p>
+      <w:pPr>
+        <w:numPr>
+          <w:ilvl w:val="0"/>
+          <w:numId w:val="14"/>
+        </w:numPr>
+        <w:ind w:left="720" w:hanging="360"/>
+        <w:rPr/>
+      </w:pPr>
+      <w:r>
+        <w:rPr>
+          <w:rtl w:val="0"/>
+        </w:rPr>
+        <w:t xml:space="preserve">Multiple Choice</w:t>
+      </w:r>
+      <w:r>
+        <w:rPr>
+          <w:rtl w:val="0"/>
+        </w:rPr>
+      </w:r>
+    </w:p>
+    <w:p>
+      <w:pPr>
+        <w:numPr>
+          <w:ilvl w:val="0"/>
+          <w:numId w:val="14"/>
+        </w:numPr>
+        <w:ind w:left="720" w:hanging="360"/>
+        <w:rPr/>
+      </w:pPr>
+      <w:r>
+        <w:rPr>
+          <w:rtl w:val="0"/>
+        </w:rPr>
+        <w:t xml:space="preserve">Coding</w:t>
+      </w:r>
+      <w:r>
+        <w:rPr>
+          <w:rtl w:val="0"/>
+        </w:rPr>
+      </w:r>
+    </w:p>
+    <w:p>
+      <w:pPr>
+        <w:numPr>
+          <w:ilvl w:val="0"/>
+          <w:numId w:val="14"/>
+        </w:numPr>
+        <w:ind w:left="720" w:hanging="360"/>
+        <w:rPr/>
+      </w:pPr>
+      <w:r>
+        <w:rPr>
+          <w:rtl w:val="0"/>
+        </w:rPr>
+        <w:t xml:space="preserve">Fill in the Blank</w:t>
+      </w:r>
+    </w:p>
+    <w:p>
+      <w:pPr>
+        <w:spacing w:after="240" w:before="240" w:line="276" w:lineRule="auto"/>
+        <w:jc w:val="both"/>
+        <w:rPr/>
+      </w:pPr>
+      <w:r>
+        <w:rPr>
+          <w:rtl w:val="0"/>
+        </w:rPr>
+        <w:t xml:space="preserve">Additional exam builder features:</w:t>
+      </w:r>
+    </w:p>
+    <w:p>
+      <w:pPr>
+        <w:numPr>
+          <w:ilvl w:val="0"/>
+          <w:numId w:val="15"/>
+        </w:numPr>
+        <w:spacing w:line="276" w:lineRule="auto"/>
+        <w:ind w:left="720" w:hanging="360"/>
+        <w:jc w:val="both"/>
+        <w:rPr/>
+      </w:pPr>
+      <w:r>
+        <w:rPr>
+          <w:rtl w:val="0"/>
+        </w:rPr>
+        <w:t xml:space="preserve">Fill-in-the-Blank Question Builder </w:t>
+      </w:r>
+    </w:p>
+    <w:p>
+      <w:pPr>
+        <w:numPr>
+          <w:ilvl w:val="1"/>
+          <w:numId w:val="15"/>
+        </w:numPr>
+        <w:spacing w:line="276" w:lineRule="auto"/>
+        <w:ind w:left="1440" w:hanging="360"/>
+        <w:jc w:val="both"/>
+        <w:rPr/>
+      </w:pPr>
+      <w:r>
+        <w:rPr>
+          <w:rtl w:val="0"/>
+        </w:rPr>
+        <w:t xml:space="preserve">Create questions with one or more acceptable answers </w:t>
+      </w:r>
+    </w:p>
+    <w:p>
+      <w:pPr>
+        <w:numPr>
+          <w:ilvl w:val="1"/>
+          <w:numId w:val="15"/>
+        </w:numPr>
+        <w:spacing w:line="276" w:lineRule="auto"/>
+        <w:ind w:left="1440" w:hanging="360"/>
+        <w:jc w:val="both"/>
+        <w:rPr/>
+      </w:pPr>
+      <w:r>
+        <w:rPr>
+          <w:rtl w:val="0"/>
+        </w:rPr>
+        <w:t xml:space="preserve">Configure case sensitivity and answer matching rules </w:t>
+      </w:r>
+    </w:p>
+    <w:p>
+      <w:pPr>
+        <w:numPr>
+          <w:ilvl w:val="1"/>
+          <w:numId w:val="15"/>
+        </w:numPr>
+        <w:spacing w:line="276" w:lineRule="auto"/>
+        <w:ind w:left="1440" w:hanging="360"/>
+        <w:jc w:val="both"/>
+        <w:rPr/>
+      </w:pPr>
+      <w:r>
+        <w:rPr>
+          <w:rtl w:val="0"/>
+        </w:rPr>
+        <w:t xml:space="preserve">Configure point values for each question </w:t>
+      </w:r>
+    </w:p>
+    <w:p>
+      <w:pPr>
+        <w:numPr>
+          <w:ilvl w:val="0"/>
+          <w:numId w:val="15"/>
+        </w:numPr>
+        <w:spacing w:line="276" w:lineRule="auto"/>
+        <w:ind w:left="720" w:hanging="360"/>
+        <w:jc w:val="both"/>
+        <w:rPr/>
+      </w:pPr>
+      <w:r>
+        <w:rPr>
+          <w:rtl w:val="0"/>
+        </w:rPr>
+        <w:t xml:space="preserve">Multiple Choice Question Builder</w:t>
+      </w:r>
+      <w:r>
+        <w:rPr>
+          <w:rtl w:val="0"/>
+        </w:rPr>
+      </w:r>
+    </w:p>
+    <w:p>
+      <w:pPr>
+        <w:numPr>
+          <w:ilvl w:val="1"/>
+          <w:numId w:val="15"/>
+        </w:numPr>
+        <w:spacing w:line="276" w:lineRule="auto"/>
+        <w:ind w:left="1440" w:hanging="360"/>
+        <w:jc w:val="both"/>
+        <w:rPr/>
+      </w:pPr>
+      <w:r>
+        <w:rPr>
+          <w:rtl w:val="0"/>
+        </w:rPr>
+        <w:t xml:space="preserve">Create questions, answer choices, and correct answers</w:t>
+      </w:r>
+      <w:r>
+        <w:rPr>
+          <w:rtl w:val="0"/>
+        </w:rPr>
+      </w:r>
+    </w:p>
+    <w:p>
+      <w:pPr>
+        <w:numPr>
+          <w:ilvl w:val="1"/>
+          <w:numId w:val="15"/>
+        </w:numPr>
+        <w:spacing w:line="276" w:lineRule="auto"/>
+        <w:ind w:left="1440" w:hanging="360"/>
+        <w:jc w:val="both"/>
+        <w:rPr/>
+      </w:pPr>
+      <w:r>
+        <w:rPr>
+          <w:rtl w:val="0"/>
+        </w:rPr>
+        <w:t xml:space="preserve">Configure point values for each question</w:t>
+      </w:r>
+      <w:r>
+        <w:rPr>
+          <w:rtl w:val="0"/>
+        </w:rPr>
+      </w:r>
+    </w:p>
+    <w:p>
+      <w:pPr>
+        <w:numPr>
+          <w:ilvl w:val="0"/>
+          <w:numId w:val="15"/>
+        </w:numPr>
+        <w:spacing w:line="276" w:lineRule="auto"/>
+        <w:ind w:left="720" w:hanging="360"/>
+        <w:jc w:val="both"/>
+        <w:rPr/>
+      </w:pPr>
+      <w:r>
+        <w:rPr>
+          <w:rtl w:val="0"/>
+        </w:rPr>
+        <w:t xml:space="preserve">Coding Question Builder</w:t>
+      </w:r>
+    </w:p>
+    <w:p>
+      <w:pPr>
+        <w:numPr>
+          <w:ilvl w:val="1"/>
+          <w:numId w:val="15"/>
+        </w:numPr>
+        <w:spacing w:line="276" w:lineRule="auto"/>
+        <w:ind w:left="1440" w:hanging="360"/>
+        <w:jc w:val="both"/>
+        <w:rPr/>
+      </w:pPr>
+      <w:r>
+        <w:rPr>
+          <w:rtl w:val="0"/>
+        </w:rPr>
+        <w:t xml:space="preserve">Create programming problems with custom problem statements, input specifications, output specifications, and constraints</w:t>
+      </w:r>
+    </w:p>
+    <w:p>
+      <w:pPr>
+        <w:numPr>
+          <w:ilvl w:val="1"/>
+          <w:numId w:val="15"/>
+        </w:numPr>
+        <w:spacing w:line="276" w:lineRule="auto"/>
+        <w:ind w:left="1440" w:hanging="360"/>
+        <w:jc w:val="both"/>
+        <w:rPr/>
+      </w:pPr>
+      <w:r>
+        <w:rPr>
+          <w:rtl w:val="0"/>
+        </w:rPr>
+        <w:t xml:space="preserve">Define visible sample test cases for student practice</w:t>
+      </w:r>
+    </w:p>
+    <w:p>
+      <w:pPr>
+        <w:numPr>
+          <w:ilvl w:val="1"/>
+          <w:numId w:val="15"/>
+        </w:numPr>
+        <w:spacing w:line="276" w:lineRule="auto"/>
+        <w:ind w:left="1440" w:hanging="360"/>
+        <w:jc w:val="both"/>
+        <w:rPr/>
+      </w:pPr>
+      <w:r>
+        <w:rPr>
+          <w:rtl w:val="0"/>
+        </w:rPr>
+        <w:t xml:space="preserve">Define hidden test cases used for automated grading</w:t>
+      </w:r>
+    </w:p>
+    <w:p>
+      <w:pPr>
+        <w:numPr>
+          <w:ilvl w:val="1"/>
+          <w:numId w:val="15"/>
+        </w:numPr>
+        <w:spacing w:line="276" w:lineRule="auto"/>
+        <w:ind w:left="1440" w:hanging="360"/>
+        <w:jc w:val="both"/>
+        <w:rPr/>
+      </w:pPr>
+      <w:r>
+        <w:rPr>
+          <w:rtl w:val="0"/>
+        </w:rPr>
+        <w:t xml:space="preserve">Specify expected outputs for each test case</w:t>
+      </w:r>
+    </w:p>
+    <w:p>
+      <w:pPr>
+        <w:numPr>
+          <w:ilvl w:val="1"/>
+          <w:numId w:val="15"/>
+        </w:numPr>
+        <w:spacing w:line="276" w:lineRule="auto"/>
+        <w:ind w:left="1440" w:hanging="360"/>
+        <w:jc w:val="both"/>
+        <w:rPr/>
+      </w:pPr>
+      <w:r>
+        <w:rPr>
+          <w:rtl w:val="0"/>
+        </w:rPr>
+        <w:t xml:space="preserve">Configure time limits and scoring criteria for submissions</w:t>
+      </w:r>
+      <w:r>
+        <w:rPr>
+          <w:rtl w:val="0"/>
+        </w:rPr>
+      </w:r>
+    </w:p>
+    <w:p>
+      <w:pPr>
+        <w:numPr>
+          <w:ilvl w:val="1"/>
+          <w:numId w:val="15"/>
+        </w:numPr>
+        <w:spacing w:line="276" w:lineRule="auto"/>
+        <w:ind w:left="1440" w:hanging="360"/>
+        <w:jc w:val="both"/>
+        <w:rPr/>
+      </w:pPr>
+      <w:r>
+        <w:rPr>
+          <w:rtl w:val="0"/>
+        </w:rPr>
+        <w:t xml:space="preserve">Teachers can give out “Run Code” attempt penalties.</w:t>
+      </w:r>
+    </w:p>
+    <w:p>
+      <w:pPr>
+        <w:numPr>
+          <w:ilvl w:val="1"/>
+          <w:numId w:val="15"/>
+        </w:numPr>
+        <w:spacing w:line="276" w:lineRule="auto"/>
+        <w:ind w:left="1440" w:hanging="360"/>
+        <w:jc w:val="both"/>
+        <w:rPr/>
+      </w:pPr>
+      <w:r>
+        <w:rPr>
+          <w:rtl w:val="0"/>
+        </w:rPr>
+        <w:t xml:space="preserve">Preview and validate test cases before publishing the exam</w:t>
+      </w:r>
+      <w:r>
+        <w:rPr>
+          <w:rtl w:val="0"/>
+        </w:rPr>
+      </w:r>
+    </w:p>
+    <w:p>
+      <w:pPr>
+        <w:numPr>
+          <w:ilvl w:val="0"/>
+          <w:numId w:val="15"/>
+        </w:numPr>
+        <w:ind w:left="720" w:hanging="360"/>
+        <w:rPr/>
+      </w:pPr>
+      <w:r>
+        <w:rPr>
+          <w:rtl w:val="0"/>
+        </w:rPr>
+        <w:t xml:space="preserve">Hidden test cases are used exclusively for automated grading and are never visible to students during the examination. </w:t>
+      </w:r>
+    </w:p>
+    <w:p>
+      <w:pPr>
+        <w:numPr>
+          <w:ilvl w:val="0"/>
+          <w:numId w:val="15"/>
+        </w:numPr>
+        <w:ind w:left="720" w:hanging="360"/>
+        <w:rPr/>
+      </w:pPr>
+      <w:r>
+        <w:rPr>
+          <w:rtl w:val="0"/>
+        </w:rPr>
+        <w:t xml:space="preserve">Question order can be randomized per student to reduce answer sharing.</w:t>
+      </w:r>
+    </w:p>
+    <w:p>
+      <w:pPr>
+        <w:numPr>
+          <w:ilvl w:val="0"/>
+          <w:numId w:val="15"/>
+        </w:numPr>
+        <w:ind w:left="720" w:hanging="360"/>
+        <w:rPr/>
+      </w:pPr>
+      <w:r>
+        <w:rPr>
+          <w:rtl w:val="0"/>
+        </w:rPr>
+        <w:t xml:space="preserve">The teacher portal is web-based and accessible through the cloud-based platform from any authorized device.</w:t>
+      </w:r>
+    </w:p>
+    <w:p>
+      <w:pPr>
+        <w:numPr>
+          <w:ilvl w:val="0"/>
+          <w:numId w:val="15"/>
+        </w:numPr>
+        <w:ind w:left="720" w:hanging="360"/>
+        <w:rPr/>
+      </w:pPr>
+      <w:r>
+        <w:rPr>
+          <w:rtl w:val="0"/>
+        </w:rPr>
+        <w:t xml:space="preserve">Teacher can update scores</w:t>
+      </w:r>
+    </w:p>
+    <w:p>
+      <w:pPr>
+        <w:spacing w:after="240" w:before="240" w:line="276" w:lineRule="auto"/>
+        <w:jc w:val="both"/>
+        <w:rPr>
+          <w:b w:val="1"/>
+          <w:bCs w:val="1"/>
+        </w:rPr>
+      </w:pPr>
+      <w:r>
+        <w:rPr>
+          <w:b w:val="1"/>
+          <w:bCs w:val="1"/>
+          <w:rtl w:val="0"/>
+        </w:rPr>
+        <w:t xml:space="preserve">3. Result and Incident Report Export</w:t>
+      </w:r>
+    </w:p>
+    <w:p>
+      <w:pPr>
+        <w:numPr>
+          <w:ilvl w:val="0"/>
           <w:numId w:val="10"/>
         </w:numPr>
-        <w:spacing w:before="240" w:lineRule="auto"/>
-        <w:ind w:left="720" w:hanging="360"/>
-        <w:jc w:val="both"/>
-        <w:rPr/>
-      </w:pPr>
-      <w:r>
-        <w:rPr>
-          <w:rtl w:val="0"/>
-        </w:rPr>
-        <w:t xml:space="preserve">Displays all connected students, their current question, and their progress status.</w:t>
+        <w:spacing w:before="240" w:line="276" w:lineRule="auto"/>
+        <w:ind w:left="720" w:hanging="360"/>
+        <w:jc w:val="both"/>
+        <w:rPr/>
+      </w:pPr>
+      <w:r>
+        <w:rPr>
+          <w:rtl w:val="0"/>
+        </w:rPr>
+        <w:t xml:space="preserve">After the exam, the teacher can export a full results sheet as a CSV file.</w:t>
       </w:r>
     </w:p>
     <w:p>
@@ -1163,15 +1905,16 @@
           <w:ilvl w:val="0"/>
           <w:numId w:val="10"/>
         </w:numPr>
-        <w:ind w:left="720" w:hanging="360"/>
-        <w:jc w:val="both"/>
-        <w:rPr/>
-      </w:pPr>
-      <w:r>
-        <w:rPr>
-          <w:rtl w:val="0"/>
-        </w:rPr>
-        <w:t xml:space="preserve">Violation alerts appear instantly showing the student name, violation type, and exact timestamp.</w:t>
+        <w:spacing w:line="276" w:lineRule="auto"/>
+        <w:ind w:left="720" w:hanging="360"/>
+        <w:jc w:val="both"/>
+        <w:rPr/>
+      </w:pPr>
+      <w:r>
+        <w:rPr>
+          <w:rtl w:val="0"/>
+        </w:rPr>
+        <w:t xml:space="preserve">Results include per-student scores broken down by question.</w:t>
       </w:r>
     </w:p>
     <w:p>
@@ -1180,15 +1923,16 @@
           <w:ilvl w:val="0"/>
           <w:numId w:val="10"/>
         </w:numPr>
-        <w:ind w:left="720" w:hanging="360"/>
-        <w:jc w:val="both"/>
-        <w:rPr/>
-      </w:pPr>
-      <w:r>
-        <w:rPr>
-          <w:rtl w:val="0"/>
-        </w:rPr>
-        <w:t xml:space="preserve">Teachers can end the entire exam session or remove a specific student directly from the dashboard.</w:t>
+        <w:spacing w:line="276" w:lineRule="auto"/>
+        <w:ind w:left="720" w:hanging="360"/>
+        <w:jc w:val="both"/>
+        <w:rPr/>
+      </w:pPr>
+      <w:r>
+        <w:rPr>
+          <w:rtl w:val="0"/>
+        </w:rPr>
+        <w:t xml:space="preserve">The incident report lists all logged violations with timestamps.</w:t>
       </w:r>
     </w:p>
     <w:p>
@@ -1197,80 +1941,34 @@
           <w:ilvl w:val="0"/>
           <w:numId w:val="10"/>
         </w:numPr>
-        <w:ind w:left="720" w:hanging="360"/>
-        <w:jc w:val="both"/>
-        <w:rPr/>
-      </w:pPr>
-      <w:r>
-        <w:rPr>
-          <w:rtl w:val="0"/>
-        </w:rPr>
-        <w:t xml:space="preserve">Student movement tracker logs every action taken during the exam, including question navigation, focus changes, and submission events.</w:t>
-      </w:r>
-    </w:p>
-    <w:p>
-      <w:pPr>
-        <w:numPr>
-          <w:ilvl w:val="0"/>
-          <w:numId w:val="10"/>
-        </w:numPr>
-        <w:ind w:left="720" w:hanging="360"/>
-        <w:jc w:val="both"/>
-        <w:rPr/>
-      </w:pPr>
-      <w:r>
-        <w:rPr>
-          <w:rtl w:val="0"/>
-        </w:rPr>
-        <w:t xml:space="preserve">Score analytics are displayed after the exam, including per-student breakdowns and question-level performance.</w:t>
-      </w:r>
-    </w:p>
-    <w:p>
-      <w:pPr>
-        <w:numPr>
-          <w:ilvl w:val="0"/>
-          <w:numId w:val="10"/>
-        </w:numPr>
-        <w:ind w:left="720" w:hanging="360"/>
-        <w:jc w:val="both"/>
-        <w:rPr/>
-      </w:pPr>
-      <w:r>
-        <w:rPr>
-          <w:rtl w:val="0"/>
-        </w:rPr>
-        <w:t xml:space="preserve">Teachers can access and manage exams through their accounts from any authorized device with an internet connection.</w:t>
-      </w:r>
-    </w:p>
-    <w:p>
-      <w:pPr>
-        <w:spacing w:after="240" w:before="240" w:lineRule="auto"/>
-        <w:jc w:val="both"/>
-        <w:rPr>
-          <w:b w:val="1"/>
-          <w:bCs w:val="1"/>
-        </w:rPr>
-      </w:pPr>
-      <w:r>
-        <w:rPr>
-          <w:b w:val="1"/>
-          <w:bCs w:val="1"/>
-          <w:rtl w:val="0"/>
-        </w:rPr>
-        <w:t xml:space="preserve">2. Multi-Type Exam Builder </w:t>
-      </w:r>
-    </w:p>
-    <w:p>
-      <w:pPr>
-        <w:spacing w:after="240" w:before="240" w:lineRule="auto"/>
-        <w:jc w:val="both"/>
-        <w:rPr/>
-      </w:pPr>
-      <w:r>
-        <w:rPr>
-          <w:rtl w:val="0"/>
-        </w:rPr>
-        <w:t xml:space="preserve">Teachers build exams entirely through the web-based teacher portal. A single exam can combine any mix of the following question types:</w:t>
+        <w:spacing w:after="240" w:line="276" w:lineRule="auto"/>
+        <w:ind w:left="720" w:hanging="360"/>
+        <w:jc w:val="both"/>
+        <w:rPr/>
+      </w:pPr>
+      <w:r>
+        <w:rPr>
+          <w:rtl w:val="0"/>
+        </w:rPr>
+        <w:t xml:space="preserve">Exports are generated immediately after the exam ends with no additional configuration.</w:t>
+      </w:r>
+    </w:p>
+    <w:p>
+      <w:pPr>
+        <w:spacing w:after="240" w:before="240" w:line="276" w:lineRule="auto"/>
+        <w:jc w:val="both"/>
+        <w:rPr>
+          <w:b w:val="1"/>
+          <w:bCs w:val="1"/>
+        </w:rPr>
+      </w:pPr>
+      <w:r>
+        <w:rPr>
+          <w:b w:val="1"/>
+          <w:bCs w:val="1"/>
+          <w:rtl w:val="0"/>
+        </w:rPr>
+        <w:t xml:space="preserve">4. Cloud-Based Synchronization </w:t>
       </w:r>
     </w:p>
     <w:p>
@@ -1279,16 +1977,16 @@
           <w:ilvl w:val="0"/>
           <w:numId w:val="6"/>
         </w:numPr>
-        <w:spacing w:before="240" w:lineRule="auto"/>
-        <w:ind w:left="720" w:hanging="360"/>
-        <w:jc w:val="both"/>
-        <w:rPr/>
-      </w:pPr>
-      <w:r>
-        <w:rPr>
-          <w:rtl w:val="0"/>
-        </w:rPr>
-        <w:t xml:space="preserve">Fill in the Blanks</w:t>
+        <w:spacing w:line="276" w:lineRule="auto"/>
+        <w:ind w:left="720" w:hanging="360"/>
+        <w:jc w:val="both"/>
+        <w:rPr/>
+      </w:pPr>
+      <w:r>
+        <w:rPr>
+          <w:rtl w:val="0"/>
+        </w:rPr>
+        <w:t xml:space="preserve">Exam delivery</w:t>
       </w:r>
     </w:p>
     <w:p>
@@ -1297,15 +1995,16 @@
           <w:ilvl w:val="0"/>
           <w:numId w:val="6"/>
         </w:numPr>
-        <w:ind w:left="720" w:hanging="360"/>
-        <w:jc w:val="both"/>
-        <w:rPr/>
-      </w:pPr>
-      <w:r>
-        <w:rPr>
-          <w:rtl w:val="0"/>
-        </w:rPr>
-        <w:t xml:space="preserve">Multiple Choice</w:t>
+        <w:spacing w:line="276" w:lineRule="auto"/>
+        <w:ind w:left="720" w:hanging="360"/>
+        <w:jc w:val="both"/>
+        <w:rPr/>
+      </w:pPr>
+      <w:r>
+        <w:rPr>
+          <w:rtl w:val="0"/>
+        </w:rPr>
+        <w:t xml:space="preserve">Student progress updates</w:t>
       </w:r>
     </w:p>
     <w:p>
@@ -1314,503 +2013,7 @@
           <w:ilvl w:val="0"/>
           <w:numId w:val="6"/>
         </w:numPr>
-        <w:spacing w:after="240" w:lineRule="auto"/>
-        <w:ind w:left="720" w:hanging="360"/>
-        <w:jc w:val="both"/>
-        <w:rPr/>
-      </w:pPr>
-      <w:r>
-        <w:rPr>
-          <w:rtl w:val="0"/>
-        </w:rPr>
-        <w:t xml:space="preserve">Coding</w:t>
-      </w:r>
-    </w:p>
-    <w:p>
-      <w:pPr>
-        <w:spacing w:after="240" w:before="240" w:lineRule="auto"/>
-        <w:jc w:val="both"/>
-        <w:rPr/>
-      </w:pPr>
-      <w:r>
-        <w:rPr>
-          <w:rtl w:val="0"/>
-        </w:rPr>
-        <w:t xml:space="preserve">Additional exam builder features:</w:t>
-      </w:r>
-    </w:p>
-    <w:p>
-      <w:pPr>
-        <w:numPr>
-          <w:ilvl w:val="0"/>
-          <w:numId w:val="5"/>
-        </w:numPr>
-        <w:ind w:left="720" w:hanging="360"/>
-        <w:jc w:val="both"/>
-        <w:rPr/>
-      </w:pPr>
-      <w:r>
-        <w:rPr>
-          <w:rtl w:val="0"/>
-        </w:rPr>
-        <w:t xml:space="preserve">Fill-in-the-Blank Question Builder </w:t>
-      </w:r>
-    </w:p>
-    <w:p>
-      <w:pPr>
-        <w:numPr>
-          <w:ilvl w:val="1"/>
-          <w:numId w:val="5"/>
-        </w:numPr>
-        <w:ind w:left="1440" w:hanging="360"/>
-        <w:jc w:val="both"/>
-        <w:rPr/>
-      </w:pPr>
-      <w:r>
-        <w:rPr>
-          <w:rtl w:val="0"/>
-        </w:rPr>
-        <w:t xml:space="preserve">Create questions with one or more acceptable answers </w:t>
-      </w:r>
-    </w:p>
-    <w:p>
-      <w:pPr>
-        <w:numPr>
-          <w:ilvl w:val="1"/>
-          <w:numId w:val="5"/>
-        </w:numPr>
-        <w:ind w:left="1440" w:hanging="360"/>
-        <w:jc w:val="both"/>
-        <w:rPr/>
-      </w:pPr>
-      <w:r>
-        <w:rPr>
-          <w:rtl w:val="0"/>
-        </w:rPr>
-        <w:t xml:space="preserve">Configure case sensitivity and answer matching rules </w:t>
-      </w:r>
-    </w:p>
-    <w:p>
-      <w:pPr>
-        <w:numPr>
-          <w:ilvl w:val="1"/>
-          <w:numId w:val="5"/>
-        </w:numPr>
-        <w:ind w:left="1440" w:hanging="360"/>
-        <w:jc w:val="both"/>
-        <w:rPr/>
-      </w:pPr>
-      <w:r>
-        <w:rPr>
-          <w:rtl w:val="0"/>
-        </w:rPr>
-        <w:t xml:space="preserve">Configure point values for each question </w:t>
-      </w:r>
-    </w:p>
-    <w:p>
-      <w:pPr>
-        <w:numPr>
-          <w:ilvl w:val="0"/>
-          <w:numId w:val="5"/>
-        </w:numPr>
-        <w:ind w:left="720" w:hanging="360"/>
-        <w:jc w:val="both"/>
-        <w:rPr/>
-      </w:pPr>
-      <w:r>
-        <w:rPr>
-          <w:rtl w:val="0"/>
-        </w:rPr>
-        <w:t xml:space="preserve">Multiple Choice Question Builder </w:t>
-      </w:r>
-    </w:p>
-    <w:p>
-      <w:pPr>
-        <w:numPr>
-          <w:ilvl w:val="1"/>
-          <w:numId w:val="5"/>
-        </w:numPr>
-        <w:ind w:left="1440" w:hanging="360"/>
-        <w:jc w:val="both"/>
-        <w:rPr/>
-      </w:pPr>
-      <w:r>
-        <w:rPr>
-          <w:rtl w:val="0"/>
-        </w:rPr>
-        <w:t xml:space="preserve">Create questions, answer choices, and correct answers </w:t>
-      </w:r>
-    </w:p>
-    <w:p>
-      <w:pPr>
-        <w:numPr>
-          <w:ilvl w:val="1"/>
-          <w:numId w:val="5"/>
-        </w:numPr>
-        <w:ind w:left="1440" w:hanging="360"/>
-        <w:jc w:val="both"/>
-        <w:rPr/>
-      </w:pPr>
-      <w:r>
-        <w:rPr>
-          <w:rtl w:val="0"/>
-        </w:rPr>
-        <w:t xml:space="preserve">Configure point values for each question </w:t>
-      </w:r>
-    </w:p>
-    <w:p>
-      <w:pPr>
-        <w:numPr>
-          <w:ilvl w:val="0"/>
-          <w:numId w:val="5"/>
-        </w:numPr>
-        <w:ind w:left="720" w:hanging="360"/>
-        <w:jc w:val="both"/>
-        <w:rPr/>
-      </w:pPr>
-      <w:r>
-        <w:rPr>
-          <w:rtl w:val="0"/>
-        </w:rPr>
-        <w:t xml:space="preserve">Coding Question Builder </w:t>
-      </w:r>
-    </w:p>
-    <w:p>
-      <w:pPr>
-        <w:numPr>
-          <w:ilvl w:val="1"/>
-          <w:numId w:val="5"/>
-        </w:numPr>
-        <w:ind w:left="1440" w:hanging="360"/>
-        <w:jc w:val="both"/>
-        <w:rPr/>
-      </w:pPr>
-      <w:r>
-        <w:rPr>
-          <w:rtl w:val="0"/>
-        </w:rPr>
-        <w:t xml:space="preserve">Create programming problems with custom problem statements, input specifications, output specifications, and constraints </w:t>
-      </w:r>
-    </w:p>
-    <w:p>
-      <w:pPr>
-        <w:numPr>
-          <w:ilvl w:val="1"/>
-          <w:numId w:val="5"/>
-        </w:numPr>
-        <w:ind w:left="1440" w:hanging="360"/>
-        <w:jc w:val="both"/>
-        <w:rPr/>
-      </w:pPr>
-      <w:r>
-        <w:rPr>
-          <w:rtl w:val="0"/>
-        </w:rPr>
-        <w:t xml:space="preserve">Define visible sample test cases for student practice </w:t>
-      </w:r>
-    </w:p>
-    <w:p>
-      <w:pPr>
-        <w:numPr>
-          <w:ilvl w:val="1"/>
-          <w:numId w:val="5"/>
-        </w:numPr>
-        <w:ind w:left="1440" w:hanging="360"/>
-        <w:jc w:val="both"/>
-        <w:rPr/>
-      </w:pPr>
-      <w:r>
-        <w:rPr>
-          <w:rtl w:val="0"/>
-        </w:rPr>
-        <w:t xml:space="preserve">Define hidden test cases used for automated grading</w:t>
-      </w:r>
-    </w:p>
-    <w:p>
-      <w:pPr>
-        <w:numPr>
-          <w:ilvl w:val="1"/>
-          <w:numId w:val="5"/>
-        </w:numPr>
-        <w:ind w:left="1440" w:hanging="360"/>
-        <w:jc w:val="both"/>
-        <w:rPr/>
-      </w:pPr>
-      <w:r>
-        <w:rPr>
-          <w:rtl w:val="0"/>
-        </w:rPr>
-        <w:t xml:space="preserve">Specify expected outputs for each test case </w:t>
-      </w:r>
-    </w:p>
-    <w:p>
-      <w:pPr>
-        <w:numPr>
-          <w:ilvl w:val="1"/>
-          <w:numId w:val="5"/>
-        </w:numPr>
-        <w:ind w:left="1440" w:hanging="360"/>
-        <w:jc w:val="both"/>
-        <w:rPr/>
-      </w:pPr>
-      <w:r>
-        <w:rPr>
-          <w:rtl w:val="0"/>
-        </w:rPr>
-        <w:t xml:space="preserve">Configure time limits and scoring criteria for submissions </w:t>
-      </w:r>
-    </w:p>
-    <w:p>
-      <w:pPr>
-        <w:numPr>
-          <w:ilvl w:val="1"/>
-          <w:numId w:val="5"/>
-        </w:numPr>
-        <w:ind w:left="1440" w:hanging="360"/>
-        <w:jc w:val="both"/>
-        <w:rPr/>
-      </w:pPr>
-      <w:r>
-        <w:rPr>
-          <w:rtl w:val="0"/>
-        </w:rPr>
-        <w:t xml:space="preserve">Teachers can give out “check” penalties.</w:t>
-      </w:r>
-    </w:p>
-    <w:p>
-      <w:pPr>
-        <w:numPr>
-          <w:ilvl w:val="1"/>
-          <w:numId w:val="5"/>
-        </w:numPr>
-        <w:ind w:left="1440" w:hanging="360"/>
-        <w:jc w:val="both"/>
-        <w:rPr/>
-      </w:pPr>
-      <w:r>
-        <w:rPr>
-          <w:rtl w:val="0"/>
-        </w:rPr>
-        <w:t xml:space="preserve">Preview and validate test cases before publishing the exam </w:t>
-      </w:r>
-    </w:p>
-    <w:p>
-      <w:pPr>
-        <w:numPr>
-          <w:ilvl w:val="0"/>
-          <w:numId w:val="5"/>
-        </w:numPr>
-        <w:spacing w:before="240" w:lineRule="auto"/>
-        <w:ind w:left="720" w:hanging="360"/>
-        <w:jc w:val="both"/>
-        <w:rPr/>
-      </w:pPr>
-      <w:r>
-        <w:rPr>
-          <w:rtl w:val="0"/>
-        </w:rPr>
-        <w:t xml:space="preserve">Hidden test cases are used exclusively for automated grading and are never visible to students during the examination. </w:t>
-      </w:r>
-    </w:p>
-    <w:p>
-      <w:pPr>
-        <w:numPr>
-          <w:ilvl w:val="0"/>
-          <w:numId w:val="5"/>
-        </w:numPr>
-        <w:ind w:left="720" w:hanging="360"/>
-        <w:jc w:val="both"/>
-        <w:rPr/>
-      </w:pPr>
-      <w:r>
-        <w:rPr>
-          <w:rtl w:val="0"/>
-        </w:rPr>
-        <w:t xml:space="preserve">Question order can be randomized per student to reduce answer sharing.</w:t>
-      </w:r>
-    </w:p>
-    <w:p>
-      <w:pPr>
-        <w:numPr>
-          <w:ilvl w:val="0"/>
-          <w:numId w:val="5"/>
-        </w:numPr>
-        <w:spacing w:after="240" w:lineRule="auto"/>
-        <w:ind w:left="720" w:hanging="360"/>
-        <w:jc w:val="both"/>
-        <w:rPr/>
-      </w:pPr>
-      <w:r>
-        <w:rPr>
-          <w:rtl w:val="0"/>
-        </w:rPr>
-        <w:t xml:space="preserve">The teacher portal is web-based and accessible through the cloud-based platform from any authorized device.</w:t>
-      </w:r>
-    </w:p>
-    <w:p>
-      <w:pPr>
-        <w:numPr>
-          <w:ilvl w:val="0"/>
-          <w:numId w:val="5"/>
-        </w:numPr>
-        <w:spacing w:after="240" w:lineRule="auto"/>
-        <w:ind w:left="720" w:hanging="360"/>
-        <w:jc w:val="both"/>
-        <w:rPr/>
-      </w:pPr>
-      <w:r>
-        <w:rPr>
-          <w:rtl w:val="0"/>
-        </w:rPr>
-        <w:t xml:space="preserve">Teacher can update scores</w:t>
-      </w:r>
-    </w:p>
-    <w:p>
-      <w:pPr>
-        <w:spacing w:after="240" w:before="240" w:lineRule="auto"/>
-        <w:jc w:val="both"/>
-        <w:rPr>
-          <w:b w:val="1"/>
-          <w:bCs w:val="1"/>
-        </w:rPr>
-      </w:pPr>
-      <w:r>
-        <w:rPr>
-          <w:b w:val="1"/>
-          <w:bCs w:val="1"/>
-          <w:rtl w:val="0"/>
-        </w:rPr>
-        <w:t xml:space="preserve">3. Result and Incident Report Export</w:t>
-      </w:r>
-    </w:p>
-    <w:p>
-      <w:pPr>
-        <w:numPr>
-          <w:ilvl w:val="0"/>
-          <w:numId w:val="1"/>
-        </w:numPr>
-        <w:spacing w:before="240" w:lineRule="auto"/>
-        <w:ind w:left="720" w:hanging="360"/>
-        <w:jc w:val="both"/>
-        <w:rPr/>
-      </w:pPr>
-      <w:r>
-        <w:rPr>
-          <w:rtl w:val="0"/>
-        </w:rPr>
-        <w:t xml:space="preserve">After the exam, the teacher can export a full results sheet as a CSV file.</w:t>
-      </w:r>
-    </w:p>
-    <w:p>
-      <w:pPr>
-        <w:numPr>
-          <w:ilvl w:val="0"/>
-          <w:numId w:val="1"/>
-        </w:numPr>
-        <w:ind w:left="720" w:hanging="360"/>
-        <w:jc w:val="both"/>
-        <w:rPr/>
-      </w:pPr>
-      <w:r>
-        <w:rPr>
-          <w:rtl w:val="0"/>
-        </w:rPr>
-        <w:t xml:space="preserve">Results include per-student scores broken down by question.</w:t>
-      </w:r>
-    </w:p>
-    <w:p>
-      <w:pPr>
-        <w:numPr>
-          <w:ilvl w:val="0"/>
-          <w:numId w:val="1"/>
-        </w:numPr>
-        <w:ind w:left="720" w:hanging="360"/>
-        <w:jc w:val="both"/>
-        <w:rPr/>
-      </w:pPr>
-      <w:r>
-        <w:rPr>
-          <w:rtl w:val="0"/>
-        </w:rPr>
-        <w:t xml:space="preserve">The incident report lists all logged violations with timestamps.</w:t>
-      </w:r>
-    </w:p>
-    <w:p>
-      <w:pPr>
-        <w:numPr>
-          <w:ilvl w:val="0"/>
-          <w:numId w:val="1"/>
-        </w:numPr>
-        <w:spacing w:after="240" w:lineRule="auto"/>
-        <w:ind w:left="720" w:hanging="360"/>
-        <w:jc w:val="both"/>
-        <w:rPr/>
-      </w:pPr>
-      <w:r>
-        <w:rPr>
-          <w:rtl w:val="0"/>
-        </w:rPr>
-        <w:t xml:space="preserve">Exports are generated immediately after the exam ends with no additional configuration.</w:t>
-      </w:r>
-    </w:p>
-    <w:p>
-      <w:pPr>
-        <w:spacing w:after="240" w:before="240" w:lineRule="auto"/>
-        <w:jc w:val="both"/>
-        <w:rPr>
-          <w:b w:val="1"/>
-          <w:bCs w:val="1"/>
-        </w:rPr>
-      </w:pPr>
-      <w:r>
-        <w:rPr>
-          <w:b w:val="1"/>
-          <w:bCs w:val="1"/>
-          <w:rtl w:val="0"/>
-        </w:rPr>
-        <w:t xml:space="preserve">4. Cloud-Based Synchronization </w:t>
-      </w:r>
-    </w:p>
-    <w:p>
-      <w:pPr>
-        <w:numPr>
-          <w:ilvl w:val="0"/>
-          <w:numId w:val="10"/>
-        </w:numPr>
-        <w:ind w:left="720" w:hanging="360"/>
-        <w:jc w:val="both"/>
-        <w:rPr/>
-      </w:pPr>
-      <w:r>
-        <w:rPr>
-          <w:rtl w:val="0"/>
-        </w:rPr>
-        <w:t xml:space="preserve">Exam delivery, </w:t>
-      </w:r>
-    </w:p>
-    <w:p>
-      <w:pPr>
-        <w:numPr>
-          <w:ilvl w:val="0"/>
-          <w:numId w:val="10"/>
-        </w:numPr>
-        <w:ind w:left="720" w:hanging="360"/>
-        <w:jc w:val="both"/>
-        <w:rPr/>
-      </w:pPr>
-      <w:r>
-        <w:rPr>
-          <w:rtl w:val="0"/>
-        </w:rPr>
-        <w:t xml:space="preserve">Student progress updates</w:t>
-      </w:r>
-    </w:p>
-    <w:p>
-      <w:pPr>
-        <w:numPr>
-          <w:ilvl w:val="0"/>
-          <w:numId w:val="10"/>
-        </w:numPr>
+        <w:spacing w:line="276" w:lineRule="auto"/>
         <w:ind w:left="720" w:hanging="360"/>
         <w:jc w:val="both"/>
         <w:rPr/>
@@ -1826,8 +2029,9 @@
       <w:pPr>
         <w:numPr>
           <w:ilvl w:val="0"/>
-          <w:numId w:val="10"/>
-        </w:numPr>
+          <w:numId w:val="6"/>
+        </w:numPr>
+        <w:spacing w:line="276" w:lineRule="auto"/>
         <w:ind w:left="720" w:hanging="360"/>
         <w:jc w:val="both"/>
         <w:rPr/>
@@ -1843,8 +2047,9 @@
       <w:pPr>
         <w:numPr>
           <w:ilvl w:val="0"/>
-          <w:numId w:val="10"/>
-        </w:numPr>
+          <w:numId w:val="6"/>
+        </w:numPr>
+        <w:spacing w:line="276" w:lineRule="auto"/>
         <w:ind w:left="720" w:hanging="360"/>
         <w:jc w:val="both"/>
         <w:rPr/>
@@ -1858,7 +2063,7 @@
     </w:p>
     <w:p>
       <w:pPr>
-        <w:spacing w:after="240" w:before="240" w:lineRule="auto"/>
+        <w:spacing w:after="240" w:before="240" w:line="276" w:lineRule="auto"/>
         <w:jc w:val="both"/>
         <w:rPr>
           <w:b w:val="1"/>
@@ -1876,7 +2081,7 @@
     </w:p>
     <w:p>
       <w:pPr>
-        <w:spacing w:after="240" w:before="240" w:lineRule="auto"/>
+        <w:spacing w:after="240" w:before="240" w:line="276" w:lineRule="auto"/>
         <w:jc w:val="both"/>
         <w:rPr/>
       </w:pPr>
@@ -1889,9 +2094,12 @@
     </w:p>
     <w:p>
       <w:pPr>
-        <w:spacing w:after="240" w:before="240" w:lineRule="auto"/>
-        <w:jc w:val="both"/>
-        <w:rPr/>
+        <w:spacing w:after="240" w:before="240" w:line="276" w:lineRule="auto"/>
+        <w:jc w:val="both"/>
+        <w:rPr>
+          <w:b w:val="1"/>
+          <w:bCs w:val="1"/>
+        </w:rPr>
       </w:pPr>
       <w:r>
         <w:rPr>
@@ -1899,6 +2107,114 @@
         </w:rPr>
         <w:t xml:space="preserve">Account Management Features (CRUD):</w:t>
       </w:r>
+      <w:r>
+        <w:rPr>
+          <w:rtl w:val="0"/>
+        </w:rPr>
+      </w:r>
+    </w:p>
+    <w:p>
+      <w:pPr>
+        <w:numPr>
+          <w:ilvl w:val="0"/>
+          <w:numId w:val="9"/>
+        </w:numPr>
+        <w:spacing w:after="0" w:afterAutospacing="0" w:before="240" w:line="276" w:lineRule="auto"/>
+        <w:ind w:left="720" w:hanging="360"/>
+        <w:rPr/>
+      </w:pPr>
+      <w:r>
+        <w:rPr>
+          <w:rtl w:val="0"/>
+        </w:rPr>
+        <w:t xml:space="preserve">Create new teacher accounts and assign system access credentials</w:t>
+      </w:r>
+    </w:p>
+    <w:p>
+      <w:pPr>
+        <w:numPr>
+          <w:ilvl w:val="0"/>
+          <w:numId w:val="9"/>
+        </w:numPr>
+        <w:spacing w:after="0" w:afterAutospacing="0" w:before="0" w:beforeAutospacing="0" w:line="276" w:lineRule="auto"/>
+        <w:ind w:left="720" w:hanging="360"/>
+        <w:rPr/>
+      </w:pPr>
+      <w:r>
+        <w:rPr>
+          <w:rtl w:val="0"/>
+        </w:rPr>
+        <w:t xml:space="preserve">View and search all registered teacher accounts</w:t>
+      </w:r>
+    </w:p>
+    <w:p>
+      <w:pPr>
+        <w:numPr>
+          <w:ilvl w:val="0"/>
+          <w:numId w:val="9"/>
+        </w:numPr>
+        <w:spacing w:after="0" w:afterAutospacing="0" w:before="0" w:beforeAutospacing="0" w:line="276" w:lineRule="auto"/>
+        <w:ind w:left="720" w:hanging="360"/>
+        <w:rPr/>
+      </w:pPr>
+      <w:r>
+        <w:rPr>
+          <w:rtl w:val="0"/>
+        </w:rPr>
+        <w:t xml:space="preserve">Update teacher account details such as name, email, and access credentials</w:t>
+      </w:r>
+    </w:p>
+    <w:p>
+      <w:pPr>
+        <w:numPr>
+          <w:ilvl w:val="0"/>
+          <w:numId w:val="9"/>
+        </w:numPr>
+        <w:spacing w:after="0" w:afterAutospacing="0" w:before="0" w:beforeAutospacing="0" w:line="276" w:lineRule="auto"/>
+        <w:ind w:left="720" w:hanging="360"/>
+        <w:rPr/>
+      </w:pPr>
+      <w:r>
+        <w:rPr>
+          <w:rtl w:val="0"/>
+        </w:rPr>
+        <w:t xml:space="preserve">Deactivate or delete teacher accounts when necessary</w:t>
+      </w:r>
+      <w:r>
+        <w:rPr>
+          <w:rtl w:val="0"/>
+        </w:rPr>
+      </w:r>
+    </w:p>
+    <w:p>
+      <w:pPr>
+        <w:numPr>
+          <w:ilvl w:val="0"/>
+          <w:numId w:val="9"/>
+        </w:numPr>
+        <w:spacing w:after="240" w:before="0" w:beforeAutospacing="0" w:line="276" w:lineRule="auto"/>
+        <w:ind w:left="720" w:hanging="360"/>
+        <w:rPr/>
+      </w:pPr>
+      <w:r>
+        <w:rPr>
+          <w:rtl w:val="0"/>
+        </w:rPr>
+        <w:t xml:space="preserve">Reset teacher passwords when requested or required</w:t>
+      </w:r>
+    </w:p>
+    <w:p>
+      <w:pPr>
+        <w:spacing w:after="240" w:before="240" w:line="276" w:lineRule="auto"/>
+        <w:jc w:val="both"/>
+        <w:rPr/>
+      </w:pPr>
+      <w:r>
+        <w:rPr>
+          <w:rtl w:val="0"/>
+        </w:rPr>
+        <w:t xml:space="preserve">Audit Logging Features:</w:t>
+      </w:r>
     </w:p>
     <w:p>
       <w:pPr>
@@ -1906,15 +2222,15 @@
           <w:ilvl w:val="0"/>
           <w:numId w:val="13"/>
         </w:numPr>
-        <w:spacing w:before="240" w:lineRule="auto"/>
-        <w:ind w:left="720" w:hanging="360"/>
-        <w:rPr/>
-      </w:pPr>
-      <w:r>
-        <w:rPr>
-          <w:rtl w:val="0"/>
-        </w:rPr>
-        <w:t xml:space="preserve">Create new teacher accounts and assign system access credentials</w:t>
+        <w:spacing w:after="0" w:afterAutospacing="0" w:before="240" w:line="276" w:lineRule="auto"/>
+        <w:ind w:left="720" w:hanging="360"/>
+        <w:rPr/>
+      </w:pPr>
+      <w:r>
+        <w:rPr>
+          <w:rtl w:val="0"/>
+        </w:rPr>
+        <w:t xml:space="preserve">All administrative actions are automatically recorded in an audit log</w:t>
       </w:r>
     </w:p>
     <w:p>
@@ -1923,14 +2239,15 @@
           <w:ilvl w:val="0"/>
           <w:numId w:val="13"/>
         </w:numPr>
-        <w:ind w:left="720" w:hanging="360"/>
-        <w:rPr/>
-      </w:pPr>
-      <w:r>
-        <w:rPr>
-          <w:rtl w:val="0"/>
-        </w:rPr>
-        <w:t xml:space="preserve">View and search all registered teacher accounts</w:t>
+        <w:spacing w:after="0" w:afterAutospacing="0" w:before="0" w:beforeAutospacing="0" w:line="276" w:lineRule="auto"/>
+        <w:ind w:left="720" w:hanging="360"/>
+        <w:rPr/>
+      </w:pPr>
+      <w:r>
+        <w:rPr>
+          <w:rtl w:val="0"/>
+        </w:rPr>
+        <w:t xml:space="preserve">Logs include account creation, updates, deletions, password resets, and access changes</w:t>
       </w:r>
     </w:p>
     <w:p>
@@ -1939,14 +2256,15 @@
           <w:ilvl w:val="0"/>
           <w:numId w:val="13"/>
         </w:numPr>
-        <w:ind w:left="720" w:hanging="360"/>
-        <w:rPr/>
-      </w:pPr>
-      <w:r>
-        <w:rPr>
-          <w:rtl w:val="0"/>
-        </w:rPr>
-        <w:t xml:space="preserve">Update teacher account details such as name, email, and access credentials</w:t>
+        <w:spacing w:after="0" w:afterAutospacing="0" w:before="0" w:beforeAutospacing="0" w:line="276" w:lineRule="auto"/>
+        <w:ind w:left="720" w:hanging="360"/>
+        <w:rPr/>
+      </w:pPr>
+      <w:r>
+        <w:rPr>
+          <w:rtl w:val="0"/>
+        </w:rPr>
+        <w:t xml:space="preserve">Each audit record contains the action performed, affected account, timestamp, and administrator responsible</w:t>
       </w:r>
     </w:p>
     <w:p>
@@ -1955,152 +2273,60 @@
           <w:ilvl w:val="0"/>
           <w:numId w:val="13"/>
         </w:numPr>
-        <w:ind w:left="720" w:hanging="360"/>
-        <w:rPr/>
-      </w:pPr>
-      <w:r>
-        <w:rPr>
-          <w:rtl w:val="0"/>
-        </w:rPr>
-        <w:t xml:space="preserve">Deactivate or delete teacher accounts when necessary</w:t>
-      </w:r>
-    </w:p>
-    <w:p>
-      <w:pPr>
-        <w:numPr>
-          <w:ilvl w:val="0"/>
-          <w:numId w:val="13"/>
-        </w:numPr>
-        <w:spacing w:after="240" w:lineRule="auto"/>
-        <w:ind w:left="720" w:hanging="360"/>
-        <w:rPr/>
-      </w:pPr>
-      <w:r>
-        <w:rPr>
-          <w:rtl w:val="0"/>
-        </w:rPr>
-        <w:t xml:space="preserve">Reset teacher passwords when requested or required</w:t>
-      </w:r>
-    </w:p>
-    <w:p>
-      <w:pPr>
-        <w:spacing w:after="240" w:before="240" w:lineRule="auto"/>
-        <w:jc w:val="both"/>
-        <w:rPr/>
-      </w:pPr>
-      <w:r>
-        <w:rPr>
-          <w:rtl w:val="0"/>
-        </w:rPr>
-        <w:t xml:space="preserve">Audit Logging Features:</w:t>
-      </w:r>
-    </w:p>
-    <w:p>
-      <w:pPr>
-        <w:numPr>
-          <w:ilvl w:val="0"/>
-          <w:numId w:val="3"/>
-        </w:numPr>
-        <w:spacing w:before="240" w:lineRule="auto"/>
-        <w:ind w:left="720" w:hanging="360"/>
-        <w:rPr/>
-      </w:pPr>
-      <w:r>
-        <w:rPr>
-          <w:rtl w:val="0"/>
-        </w:rPr>
-        <w:t xml:space="preserve">All administrative actions are automatically recorded in an audit log</w:t>
-      </w:r>
-    </w:p>
-    <w:p>
-      <w:pPr>
-        <w:numPr>
-          <w:ilvl w:val="0"/>
-          <w:numId w:val="3"/>
-        </w:numPr>
-        <w:ind w:left="720" w:hanging="360"/>
-        <w:rPr/>
-      </w:pPr>
-      <w:r>
-        <w:rPr>
-          <w:rtl w:val="0"/>
-        </w:rPr>
-        <w:t xml:space="preserve">Logs include account creation, updates, deletions, password resets, and access changes</w:t>
-      </w:r>
-    </w:p>
-    <w:p>
-      <w:pPr>
-        <w:numPr>
-          <w:ilvl w:val="0"/>
-          <w:numId w:val="3"/>
-        </w:numPr>
-        <w:ind w:left="720" w:hanging="360"/>
-        <w:rPr/>
-      </w:pPr>
-      <w:r>
-        <w:rPr>
-          <w:rtl w:val="0"/>
-        </w:rPr>
-        <w:t xml:space="preserve">Each audit record contains the action performed, affected account, timestamp, and administrator responsible</w:t>
-      </w:r>
-    </w:p>
-    <w:p>
-      <w:pPr>
-        <w:numPr>
-          <w:ilvl w:val="0"/>
-          <w:numId w:val="3"/>
-        </w:numPr>
-        <w:spacing w:after="240" w:lineRule="auto"/>
-        <w:ind w:left="720" w:hanging="360"/>
-        <w:rPr/>
-      </w:pPr>
-      <w:r>
-        <w:rPr>
-          <w:rtl w:val="0"/>
-        </w:rPr>
-        <w:t xml:space="preserve">Audit logs can be reviewed for accountability, monitoring, and system security investigation</w:t>
-      </w:r>
-    </w:p>
-    <w:p>
-      <w:pPr>
-        <w:spacing w:after="240" w:before="240" w:lineRule="auto"/>
-        <w:jc w:val="both"/>
-        <w:rPr>
-          <w:b w:val="1"/>
-          <w:bCs w:val="1"/>
-        </w:rPr>
-      </w:pPr>
-      <w:r>
-        <w:rPr>
-          <w:rtl w:val="0"/>
-        </w:rPr>
-      </w:r>
-    </w:p>
-    <w:p>
-      <w:pPr>
-        <w:spacing w:after="240" w:before="240" w:lineRule="auto"/>
-        <w:jc w:val="both"/>
-        <w:rPr>
-          <w:b w:val="1"/>
-          <w:bCs w:val="1"/>
-        </w:rPr>
-      </w:pPr>
-      <w:r>
-        <w:rPr>
-          <w:rtl w:val="0"/>
-        </w:rPr>
-      </w:r>
-    </w:p>
-    <w:p>
-      <w:pPr>
-        <w:rPr>
-          <w:b w:val="1"/>
-          <w:bCs w:val="1"/>
-        </w:rPr>
-      </w:pPr>
-      <w:r>
-        <w:br w:type="page"/>
-      </w:r>
+        <w:spacing w:after="240" w:before="0" w:beforeAutospacing="0" w:line="276" w:lineRule="auto"/>
+        <w:ind w:left="720" w:hanging="360"/>
+        <w:rPr/>
+      </w:pPr>
+      <w:r>
+        <w:rPr>
+          <w:rtl w:val="0"/>
+        </w:rPr>
+        <w:t xml:space="preserve">Audit logs can be reviewed for accountability, monitoring, and system security investigation </w:t>
+      </w:r>
+      <w:r>
+        <w:rPr>
+          <w:rtl w:val="0"/>
+        </w:rPr>
+      </w:r>
+    </w:p>
+    <w:p>
+      <w:pPr>
+        <w:spacing w:after="240" w:before="240" w:line="276" w:lineRule="auto"/>
+        <w:jc w:val="both"/>
+        <w:rPr>
+          <w:b w:val="1"/>
+          <w:bCs w:val="1"/>
+        </w:rPr>
+      </w:pPr>
+      <w:r>
+        <w:rPr>
+          <w:rtl w:val="0"/>
+        </w:rPr>
+      </w:r>
+    </w:p>
+    <w:p>
+      <w:pPr>
+        <w:spacing w:after="240" w:before="240" w:line="276" w:lineRule="auto"/>
+        <w:jc w:val="both"/>
+        <w:rPr>
+          <w:b w:val="1"/>
+          <w:bCs w:val="1"/>
+        </w:rPr>
+      </w:pPr>
+      <w:r>
+        <w:rPr>
+          <w:rtl w:val="0"/>
+        </w:rPr>
+      </w:r>
+    </w:p>
+    <w:p>
+      <w:pPr>
+        <w:spacing w:line="276" w:lineRule="auto"/>
+        <w:rPr>
+          <w:b w:val="1"/>
+          <w:bCs w:val="1"/>
+        </w:rPr>
+      </w:pPr>
       <w:r>
         <w:rPr>
           <w:rtl w:val="0"/>
@@ -2112,7 +2338,7 @@
         <w:pStyle w:val="Heading1"/>
         <w:keepNext w:val="0"/>
         <w:keepLines w:val="0"/>
-        <w:spacing w:after="240" w:before="240" w:lineRule="auto"/>
+        <w:spacing w:after="240" w:before="240" w:line="276" w:lineRule="auto"/>
         <w:rPr>
           <w:b w:val="1"/>
           <w:bCs w:val="1"/>
@@ -2135,7 +2361,7 @@
     </w:p>
     <w:p>
       <w:pPr>
-        <w:spacing w:after="240" w:before="240" w:lineRule="auto"/>
+        <w:spacing w:after="240" w:before="240" w:line="276" w:lineRule="auto"/>
         <w:jc w:val="both"/>
         <w:rPr>
           <w:b w:val="1"/>
@@ -2155,8 +2381,9 @@
       <w:pPr>
         <w:numPr>
           <w:ilvl w:val="0"/>
-          <w:numId w:val="10"/>
-        </w:numPr>
+          <w:numId w:val="6"/>
+        </w:numPr>
+        <w:spacing w:line="276" w:lineRule="auto"/>
         <w:ind w:left="720" w:hanging="360"/>
         <w:jc w:val="both"/>
         <w:rPr/>
@@ -2172,8 +2399,9 @@
       <w:pPr>
         <w:numPr>
           <w:ilvl w:val="0"/>
-          <w:numId w:val="10"/>
-        </w:numPr>
+          <w:numId w:val="6"/>
+        </w:numPr>
+        <w:spacing w:line="276" w:lineRule="auto"/>
         <w:ind w:left="720" w:hanging="360"/>
         <w:jc w:val="both"/>
         <w:rPr/>
@@ -2187,7 +2415,7 @@
     </w:p>
     <w:p>
       <w:pPr>
-        <w:spacing w:after="240" w:before="240" w:lineRule="auto"/>
+        <w:spacing w:after="240" w:before="240" w:line="276" w:lineRule="auto"/>
         <w:jc w:val="both"/>
         <w:rPr>
           <w:b w:val="1"/>
@@ -2207,8 +2435,9 @@
       <w:pPr>
         <w:numPr>
           <w:ilvl w:val="0"/>
-          <w:numId w:val="10"/>
-        </w:numPr>
+          <w:numId w:val="6"/>
+        </w:numPr>
+        <w:spacing w:line="276" w:lineRule="auto"/>
         <w:ind w:left="720" w:hanging="360"/>
         <w:jc w:val="both"/>
         <w:rPr/>
@@ -2224,8 +2453,9 @@
       <w:pPr>
         <w:numPr>
           <w:ilvl w:val="0"/>
-          <w:numId w:val="10"/>
-        </w:numPr>
+          <w:numId w:val="6"/>
+        </w:numPr>
+        <w:spacing w:line="276" w:lineRule="auto"/>
         <w:ind w:left="720" w:hanging="360"/>
         <w:jc w:val="both"/>
         <w:rPr/>
@@ -2239,19 +2469,21 @@
     </w:p>
     <w:p>
       <w:pPr>
-        <w:rPr>
-          <w:b w:val="1"/>
-          <w:bCs w:val="1"/>
-        </w:rPr>
-      </w:pPr>
-      <w:r>
-        <w:rPr>
-          <w:rtl w:val="0"/>
-        </w:rPr>
-      </w:r>
-    </w:p>
-    <w:p>
-      <w:pPr>
+        <w:spacing w:line="276" w:lineRule="auto"/>
+        <w:rPr>
+          <w:b w:val="1"/>
+          <w:bCs w:val="1"/>
+        </w:rPr>
+      </w:pPr>
+      <w:r>
+        <w:rPr>
+          <w:rtl w:val="0"/>
+        </w:rPr>
+      </w:r>
+    </w:p>
+    <w:p>
+      <w:pPr>
+        <w:spacing w:line="276" w:lineRule="auto"/>
         <w:rPr>
           <w:b w:val="1"/>
           <w:bCs w:val="1"/>
@@ -2268,25 +2500,28 @@
     </w:p>
     <w:p>
       <w:pPr>
-        <w:rPr>
-          <w:b w:val="1"/>
-          <w:bCs w:val="1"/>
-        </w:rPr>
-      </w:pPr>
-      <w:r>
-        <w:rPr>
-          <w:rtl w:val="0"/>
-        </w:rPr>
-      </w:r>
-    </w:p>
-    <w:p>
-      <w:pPr>
-        <w:numPr>
-          <w:ilvl w:val="0"/>
-          <w:numId w:val="10"/>
-        </w:numPr>
-        <w:ind w:left="720" w:hanging="360"/>
-        <w:jc w:val="both"/>
+        <w:spacing w:line="276" w:lineRule="auto"/>
+        <w:rPr>
+          <w:b w:val="1"/>
+          <w:bCs w:val="1"/>
+        </w:rPr>
+      </w:pPr>
+      <w:r>
+        <w:rPr>
+          <w:rtl w:val="0"/>
+        </w:rPr>
+      </w:r>
+    </w:p>
+    <w:p>
+      <w:pPr>
+        <w:numPr>
+          <w:ilvl w:val="0"/>
+          <w:numId w:val="6"/>
+        </w:numPr>
+        <w:spacing w:line="276" w:lineRule="auto"/>
+        <w:ind w:left="720" w:hanging="360"/>
+        <w:jc w:val="both"/>
+        <w:rPr/>
       </w:pPr>
       <w:r>
         <w:rPr>
@@ -2299,10 +2534,12 @@
       <w:pPr>
         <w:numPr>
           <w:ilvl w:val="0"/>
-          <w:numId w:val="10"/>
-        </w:numPr>
-        <w:ind w:left="720" w:hanging="360"/>
-        <w:jc w:val="both"/>
+          <w:numId w:val="6"/>
+        </w:numPr>
+        <w:spacing w:line="276" w:lineRule="auto"/>
+        <w:ind w:left="720" w:hanging="360"/>
+        <w:jc w:val="both"/>
+        <w:rPr/>
       </w:pPr>
       <w:r>
         <w:rPr>
@@ -2315,10 +2552,12 @@
       <w:pPr>
         <w:numPr>
           <w:ilvl w:val="0"/>
-          <w:numId w:val="10"/>
-        </w:numPr>
-        <w:ind w:left="720" w:hanging="360"/>
-        <w:jc w:val="both"/>
+          <w:numId w:val="6"/>
+        </w:numPr>
+        <w:spacing w:line="276" w:lineRule="auto"/>
+        <w:ind w:left="720" w:hanging="360"/>
+        <w:jc w:val="both"/>
+        <w:rPr/>
       </w:pPr>
       <w:r>
         <w:rPr>
@@ -2331,10 +2570,12 @@
       <w:pPr>
         <w:numPr>
           <w:ilvl w:val="0"/>
-          <w:numId w:val="10"/>
-        </w:numPr>
-        <w:ind w:left="720" w:hanging="360"/>
-        <w:jc w:val="both"/>
+          <w:numId w:val="6"/>
+        </w:numPr>
+        <w:spacing w:line="276" w:lineRule="auto"/>
+        <w:ind w:left="720" w:hanging="360"/>
+        <w:jc w:val="both"/>
+        <w:rPr/>
       </w:pPr>
       <w:r>
         <w:rPr>
@@ -2350,6 +2591,7 @@
     </w:p>
     <w:p>
       <w:pPr>
+        <w:spacing w:line="276" w:lineRule="auto"/>
         <w:rPr>
           <w:b w:val="1"/>
           <w:bCs w:val="1"/>
@@ -2365,6 +2607,7 @@
     </w:p>
     <w:p>
       <w:pPr>
+        <w:spacing w:line="276" w:lineRule="auto"/>
         <w:rPr>
           <w:b w:val="1"/>
           <w:bCs w:val="1"/>
@@ -2380,6 +2623,7 @@
     </w:p>
     <w:p>
       <w:pPr>
+        <w:spacing w:line="276" w:lineRule="auto"/>
         <w:rPr>
           <w:b w:val="1"/>
           <w:bCs w:val="1"/>
@@ -2395,6 +2639,7 @@
     </w:p>
     <w:p>
       <w:pPr>
+        <w:spacing w:line="276" w:lineRule="auto"/>
         <w:rPr>
           <w:b w:val="1"/>
           <w:bCs w:val="1"/>
@@ -2410,6 +2655,7 @@
     </w:p>
     <w:p>
       <w:pPr>
+        <w:spacing w:line="276" w:lineRule="auto"/>
         <w:rPr>
           <w:b w:val="1"/>
           <w:bCs w:val="1"/>
@@ -2425,6 +2671,7 @@
     </w:p>
     <w:p>
       <w:pPr>
+        <w:spacing w:line="276" w:lineRule="auto"/>
         <w:rPr>
           <w:b w:val="1"/>
           <w:bCs w:val="1"/>
@@ -2440,6 +2687,7 @@
     </w:p>
     <w:p>
       <w:pPr>
+        <w:spacing w:line="276" w:lineRule="auto"/>
         <w:rPr>
           <w:b w:val="1"/>
           <w:bCs w:val="1"/>
@@ -2455,6 +2703,7 @@
     </w:p>
     <w:p>
       <w:pPr>
+        <w:spacing w:line="276" w:lineRule="auto"/>
         <w:rPr>
           <w:b w:val="1"/>
           <w:bCs w:val="1"/>
@@ -2470,6 +2719,7 @@
     </w:p>
     <w:p>
       <w:pPr>
+        <w:spacing w:line="276" w:lineRule="auto"/>
         <w:rPr>
           <w:b w:val="1"/>
           <w:bCs w:val="1"/>
@@ -2485,6 +2735,7 @@
     </w:p>
     <w:p>
       <w:pPr>
+        <w:spacing w:line="276" w:lineRule="auto"/>
         <w:rPr>
           <w:b w:val="1"/>
           <w:bCs w:val="1"/>
@@ -2500,6 +2751,7 @@
     </w:p>
     <w:p>
       <w:pPr>
+        <w:spacing w:line="276" w:lineRule="auto"/>
         <w:rPr>
           <w:b w:val="1"/>
           <w:bCs w:val="1"/>
@@ -2515,6 +2767,7 @@
     </w:p>
     <w:p>
       <w:pPr>
+        <w:spacing w:line="276" w:lineRule="auto"/>
         <w:rPr>
           <w:b w:val="1"/>
           <w:bCs w:val="1"/>
@@ -2530,6 +2783,7 @@
     </w:p>
     <w:p>
       <w:pPr>
+        <w:spacing w:line="276" w:lineRule="auto"/>
         <w:rPr>
           <w:b w:val="1"/>
           <w:bCs w:val="1"/>
@@ -2545,6 +2799,7 @@
     </w:p>
     <w:p>
       <w:pPr>
+        <w:spacing w:line="276" w:lineRule="auto"/>
         <w:rPr>
           <w:b w:val="1"/>
           <w:bCs w:val="1"/>
@@ -2560,6 +2815,7 @@
     </w:p>
     <w:p>
       <w:pPr>
+        <w:spacing w:line="276" w:lineRule="auto"/>
         <w:rPr>
           <w:b w:val="1"/>
           <w:bCs w:val="1"/>
@@ -2575,6 +2831,7 @@
     </w:p>
     <w:p>
       <w:pPr>
+        <w:spacing w:line="276" w:lineRule="auto"/>
         <w:rPr>
           <w:b w:val="1"/>
           <w:bCs w:val="1"/>
@@ -2590,6 +2847,7 @@
     </w:p>
     <w:p>
       <w:pPr>
+        <w:spacing w:line="276" w:lineRule="auto"/>
         <w:rPr>
           <w:b w:val="1"/>
           <w:bCs w:val="1"/>
@@ -2605,6 +2863,7 @@
     </w:p>
     <w:p>
       <w:pPr>
+        <w:spacing w:line="276" w:lineRule="auto"/>
         <w:rPr>
           <w:b w:val="1"/>
           <w:bCs w:val="1"/>
@@ -2620,6 +2879,7 @@
     </w:p>
     <w:p>
       <w:pPr>
+        <w:spacing w:line="276" w:lineRule="auto"/>
         <w:rPr>
           <w:b w:val="1"/>
           <w:bCs w:val="1"/>
@@ -2635,19 +2895,21 @@
     </w:p>
     <w:p>
       <w:pPr>
-        <w:rPr>
-          <w:b w:val="1"/>
-          <w:bCs w:val="1"/>
-        </w:rPr>
-      </w:pPr>
-      <w:r>
-        <w:rPr>
-          <w:rtl w:val="0"/>
-        </w:rPr>
-      </w:r>
-    </w:p>
-    <w:p>
-      <w:pPr>
+        <w:spacing w:line="276" w:lineRule="auto"/>
+        <w:rPr>
+          <w:b w:val="1"/>
+          <w:bCs w:val="1"/>
+        </w:rPr>
+      </w:pPr>
+      <w:r>
+        <w:rPr>
+          <w:rtl w:val="0"/>
+        </w:rPr>
+      </w:r>
+    </w:p>
+    <w:p>
+      <w:pPr>
+        <w:spacing w:line="276" w:lineRule="auto"/>
         <w:rPr>
           <w:b w:val="1"/>
           <w:bCs w:val="1"/>
@@ -2664,16 +2926,18 @@
     </w:p>
     <w:p>
       <w:pPr>
-        <w:rPr/>
-      </w:pPr>
-      <w:r>
-        <w:rPr>
-          <w:rtl w:val="0"/>
-        </w:rPr>
-      </w:r>
-    </w:p>
-    <w:p>
-      <w:pPr>
+        <w:spacing w:line="276" w:lineRule="auto"/>
+        <w:rPr/>
+      </w:pPr>
+      <w:r>
+        <w:rPr>
+          <w:rtl w:val="0"/>
+        </w:rPr>
+      </w:r>
+    </w:p>
+    <w:p>
+      <w:pPr>
+        <w:spacing w:line="276" w:lineRule="auto"/>
         <w:rPr/>
       </w:pPr>
       <w:r>
@@ -2685,36 +2949,40 @@
     </w:p>
     <w:p>
       <w:pPr>
-        <w:rPr/>
-      </w:pPr>
-      <w:r>
-        <w:rPr>
-          <w:rtl w:val="0"/>
-        </w:rPr>
-      </w:r>
-    </w:p>
-    <w:p>
-      <w:pPr>
-        <w:rPr/>
-      </w:pPr>
-      <w:r>
-        <w:rPr>
-          <w:rtl w:val="0"/>
-        </w:rPr>
-      </w:r>
-    </w:p>
-    <w:p>
-      <w:pPr>
-        <w:rPr/>
-      </w:pPr>
-      <w:r>
-        <w:rPr>
-          <w:rtl w:val="0"/>
-        </w:rPr>
-      </w:r>
-    </w:p>
-    <w:p>
-      <w:pPr>
+        <w:spacing w:line="276" w:lineRule="auto"/>
+        <w:rPr/>
+      </w:pPr>
+      <w:r>
+        <w:rPr>
+          <w:rtl w:val="0"/>
+        </w:rPr>
+      </w:r>
+    </w:p>
+    <w:p>
+      <w:pPr>
+        <w:spacing w:line="276" w:lineRule="auto"/>
+        <w:rPr/>
+      </w:pPr>
+      <w:r>
+        <w:rPr>
+          <w:rtl w:val="0"/>
+        </w:rPr>
+      </w:r>
+    </w:p>
+    <w:p>
+      <w:pPr>
+        <w:spacing w:line="276" w:lineRule="auto"/>
+        <w:rPr/>
+      </w:pPr>
+      <w:r>
+        <w:rPr>
+          <w:rtl w:val="0"/>
+        </w:rPr>
+      </w:r>
+    </w:p>
+    <w:p>
+      <w:pPr>
+        <w:spacing w:line="276" w:lineRule="auto"/>
         <w:rPr>
           <w:b w:val="1"/>
           <w:bCs w:val="1"/>
@@ -2731,16 +2999,18 @@
     </w:p>
     <w:p>
       <w:pPr>
-        <w:rPr/>
-      </w:pPr>
-      <w:r>
-        <w:rPr>
-          <w:rtl w:val="0"/>
-        </w:rPr>
-      </w:r>
-    </w:p>
-    <w:p>
-      <w:pPr>
+        <w:spacing w:line="276" w:lineRule="auto"/>
+        <w:rPr/>
+      </w:pPr>
+      <w:r>
+        <w:rPr>
+          <w:rtl w:val="0"/>
+        </w:rPr>
+      </w:r>
+    </w:p>
+    <w:p>
+      <w:pPr>
+        <w:spacing w:line="276" w:lineRule="auto"/>
         <w:rPr/>
       </w:pPr>
       <w:r>
@@ -2752,36 +3022,40 @@
     </w:p>
     <w:p>
       <w:pPr>
-        <w:rPr/>
-      </w:pPr>
-      <w:r>
-        <w:rPr>
-          <w:rtl w:val="0"/>
-        </w:rPr>
-      </w:r>
-    </w:p>
-    <w:p>
-      <w:pPr>
-        <w:rPr/>
-      </w:pPr>
-      <w:r>
-        <w:rPr>
-          <w:rtl w:val="0"/>
-        </w:rPr>
-      </w:r>
-    </w:p>
-    <w:p>
-      <w:pPr>
-        <w:rPr/>
-      </w:pPr>
-      <w:r>
-        <w:rPr>
-          <w:rtl w:val="0"/>
-        </w:rPr>
-      </w:r>
-    </w:p>
-    <w:p>
-      <w:pPr>
+        <w:spacing w:line="276" w:lineRule="auto"/>
+        <w:rPr/>
+      </w:pPr>
+      <w:r>
+        <w:rPr>
+          <w:rtl w:val="0"/>
+        </w:rPr>
+      </w:r>
+    </w:p>
+    <w:p>
+      <w:pPr>
+        <w:spacing w:line="276" w:lineRule="auto"/>
+        <w:rPr/>
+      </w:pPr>
+      <w:r>
+        <w:rPr>
+          <w:rtl w:val="0"/>
+        </w:rPr>
+      </w:r>
+    </w:p>
+    <w:p>
+      <w:pPr>
+        <w:spacing w:line="276" w:lineRule="auto"/>
+        <w:rPr/>
+      </w:pPr>
+      <w:r>
+        <w:rPr>
+          <w:rtl w:val="0"/>
+        </w:rPr>
+      </w:r>
+    </w:p>
+    <w:p>
+      <w:pPr>
+        <w:spacing w:line="276" w:lineRule="auto"/>
         <w:rPr/>
       </w:pPr>
       <w:r>
@@ -2800,16 +3074,18 @@
     </w:p>
     <w:p>
       <w:pPr>
-        <w:rPr/>
-      </w:pPr>
-      <w:r>
-        <w:rPr>
-          <w:rtl w:val="0"/>
-        </w:rPr>
-      </w:r>
-    </w:p>
-    <w:p>
-      <w:pPr>
+        <w:spacing w:line="276" w:lineRule="auto"/>
+        <w:rPr/>
+      </w:pPr>
+      <w:r>
+        <w:rPr>
+          <w:rtl w:val="0"/>
+        </w:rPr>
+      </w:r>
+    </w:p>
+    <w:p>
+      <w:pPr>
+        <w:spacing w:line="276" w:lineRule="auto"/>
         <w:rPr/>
       </w:pPr>
       <w:r>
@@ -2821,36 +3097,40 @@
     </w:p>
     <w:p>
       <w:pPr>
-        <w:rPr/>
-      </w:pPr>
-      <w:r>
-        <w:rPr>
-          <w:rtl w:val="0"/>
-        </w:rPr>
-      </w:r>
-    </w:p>
-    <w:p>
-      <w:pPr>
-        <w:rPr/>
-      </w:pPr>
-      <w:r>
-        <w:rPr>
-          <w:rtl w:val="0"/>
-        </w:rPr>
-      </w:r>
-    </w:p>
-    <w:p>
-      <w:pPr>
-        <w:rPr/>
-      </w:pPr>
-      <w:r>
-        <w:rPr>
-          <w:rtl w:val="0"/>
-        </w:rPr>
-      </w:r>
-    </w:p>
-    <w:p>
-      <w:pPr>
+        <w:spacing w:line="276" w:lineRule="auto"/>
+        <w:rPr/>
+      </w:pPr>
+      <w:r>
+        <w:rPr>
+          <w:rtl w:val="0"/>
+        </w:rPr>
+      </w:r>
+    </w:p>
+    <w:p>
+      <w:pPr>
+        <w:spacing w:line="276" w:lineRule="auto"/>
+        <w:rPr/>
+      </w:pPr>
+      <w:r>
+        <w:rPr>
+          <w:rtl w:val="0"/>
+        </w:rPr>
+      </w:r>
+    </w:p>
+    <w:p>
+      <w:pPr>
+        <w:spacing w:line="276" w:lineRule="auto"/>
+        <w:rPr/>
+      </w:pPr>
+      <w:r>
+        <w:rPr>
+          <w:rtl w:val="0"/>
+        </w:rPr>
+      </w:r>
+    </w:p>
+    <w:p>
+      <w:pPr>
+        <w:spacing w:line="276" w:lineRule="auto"/>
         <w:rPr>
           <w:b w:val="1"/>
           <w:bCs w:val="1"/>
@@ -2867,16 +3147,18 @@
     </w:p>
     <w:p>
       <w:pPr>
-        <w:rPr/>
-      </w:pPr>
-      <w:r>
-        <w:rPr>
-          <w:rtl w:val="0"/>
-        </w:rPr>
-      </w:r>
-    </w:p>
-    <w:p>
-      <w:pPr>
+        <w:spacing w:line="276" w:lineRule="auto"/>
+        <w:rPr/>
+      </w:pPr>
+      <w:r>
+        <w:rPr>
+          <w:rtl w:val="0"/>
+        </w:rPr>
+      </w:r>
+    </w:p>
+    <w:p>
+      <w:pPr>
+        <w:spacing w:line="276" w:lineRule="auto"/>
         <w:rPr/>
       </w:pPr>
       <w:r>
@@ -2888,19 +3170,77 @@
     </w:p>
     <w:p>
       <w:pPr>
-        <w:rPr>
-          <w:b w:val="1"/>
-          <w:bCs w:val="1"/>
-        </w:rPr>
-      </w:pPr>
-      <w:r>
-        <w:rPr>
-          <w:rtl w:val="0"/>
-        </w:rPr>
-      </w:r>
-    </w:p>
-    <w:p>
-      <w:pPr>
+        <w:spacing w:line="276" w:lineRule="auto"/>
+        <w:rPr>
+          <w:b w:val="1"/>
+          <w:bCs w:val="1"/>
+        </w:rPr>
+      </w:pPr>
+      <w:r>
+        <w:rPr>
+          <w:rtl w:val="0"/>
+        </w:rPr>
+      </w:r>
+    </w:p>
+    <w:p>
+      <w:pPr>
+        <w:spacing w:line="276" w:lineRule="auto"/>
+        <w:rPr>
+          <w:b w:val="1"/>
+          <w:bCs w:val="1"/>
+        </w:rPr>
+      </w:pPr>
+      <w:r>
+        <w:rPr>
+          <w:rtl w:val="0"/>
+        </w:rPr>
+      </w:r>
+    </w:p>
+    <w:p>
+      <w:pPr>
+        <w:spacing w:line="276" w:lineRule="auto"/>
+        <w:rPr>
+          <w:b w:val="1"/>
+          <w:bCs w:val="1"/>
+        </w:rPr>
+      </w:pPr>
+      <w:r>
+        <w:rPr>
+          <w:rtl w:val="0"/>
+        </w:rPr>
+      </w:r>
+    </w:p>
+    <w:p>
+      <w:pPr>
+        <w:spacing w:line="276" w:lineRule="auto"/>
+        <w:rPr>
+          <w:b w:val="1"/>
+          <w:bCs w:val="1"/>
+        </w:rPr>
+      </w:pPr>
+      <w:r>
+        <w:rPr>
+          <w:rtl w:val="0"/>
+        </w:rPr>
+      </w:r>
+    </w:p>
+    <w:p>
+      <w:pPr>
+        <w:spacing w:line="276" w:lineRule="auto"/>
+        <w:rPr>
+          <w:b w:val="1"/>
+          <w:bCs w:val="1"/>
+        </w:rPr>
+      </w:pPr>
+      <w:r>
+        <w:rPr>
+          <w:rtl w:val="0"/>
+        </w:rPr>
+      </w:r>
+    </w:p>
+    <w:p>
+      <w:pPr>
+        <w:spacing w:after="0" w:before="0" w:line="276" w:lineRule="auto"/>
         <w:rPr>
           <w:b w:val="1"/>
           <w:bCs w:val="1"/>
@@ -4659,6 +4999,7 @@
     <w:pPr>
       <w:keepNext w:val="1"/>
       <w:keepLines w:val="1"/>
+      <w:pageBreakBefore w:val="0"/>
       <w:spacing w:after="120" w:before="400" w:lineRule="auto"/>
     </w:pPr>
     <w:rPr>
@@ -4673,9 +5014,12 @@
     <w:pPr>
       <w:keepNext w:val="1"/>
       <w:keepLines w:val="1"/>
+      <w:pageBreakBefore w:val="0"/>
       <w:spacing w:after="120" w:before="360" w:lineRule="auto"/>
     </w:pPr>
     <w:rPr>
+      <w:b w:val="0"/>
+      <w:bCs w:val="0"/>
       <w:sz w:val="32"/>
       <w:szCs w:val="32"/>
     </w:rPr>
@@ -4687,9 +5031,12 @@
     <w:pPr>
       <w:keepNext w:val="1"/>
       <w:keepLines w:val="1"/>
+      <w:pageBreakBefore w:val="0"/>
       <w:spacing w:after="80" w:before="320" w:lineRule="auto"/>
     </w:pPr>
     <w:rPr>
+      <w:b w:val="0"/>
+      <w:bCs w:val="0"/>
       <w:color w:val="434343"/>
       <w:sz w:val="28"/>
       <w:szCs w:val="28"/>
@@ -4702,6 +5049,7 @@
     <w:pPr>
       <w:keepNext w:val="1"/>
       <w:keepLines w:val="1"/>
+      <w:pageBreakBefore w:val="0"/>
       <w:spacing w:after="80" w:before="280" w:lineRule="auto"/>
     </w:pPr>
     <w:rPr>
@@ -4717,10 +5065,13 @@
     <w:pPr>
       <w:keepNext w:val="1"/>
       <w:keepLines w:val="1"/>
+      <w:pageBreakBefore w:val="0"/>
       <w:spacing w:after="80" w:before="240" w:lineRule="auto"/>
     </w:pPr>
     <w:rPr>
       <w:color w:val="666666"/>
+      <w:sz w:val="22"/>
+      <w:szCs w:val="22"/>
     </w:rPr>
   </w:style>
   <w:style w:type="paragraph" w:styleId="Heading6">
@@ -4730,12 +5081,15 @@
     <w:pPr>
       <w:keepNext w:val="1"/>
       <w:keepLines w:val="1"/>
+      <w:pageBreakBefore w:val="0"/>
       <w:spacing w:after="80" w:before="240" w:lineRule="auto"/>
     </w:pPr>
     <w:rPr>
       <w:i w:val="1"/>
       <w:iCs w:val="1"/>
       <w:color w:val="666666"/>
+      <w:sz w:val="22"/>
+      <w:szCs w:val="22"/>
     </w:rPr>
   </w:style>
   <w:style w:type="paragraph" w:styleId="Title">
@@ -4745,7 +5099,8 @@
     <w:pPr>
       <w:keepNext w:val="1"/>
       <w:keepLines w:val="1"/>
-      <w:spacing w:after="60" w:lineRule="auto"/>
+      <w:pageBreakBefore w:val="0"/>
+      <w:spacing w:after="60" w:before="0" w:lineRule="auto"/>
     </w:pPr>
     <w:rPr>
       <w:sz w:val="52"/>
@@ -4759,9 +5114,13 @@
     <w:pPr>
       <w:keepNext w:val="1"/>
       <w:keepLines w:val="1"/>
-      <w:spacing w:after="320" w:lineRule="auto"/>
+      <w:pageBreakBefore w:val="0"/>
+      <w:spacing w:after="320" w:before="0" w:lineRule="auto"/>
     </w:pPr>
     <w:rPr>
+      <w:rFonts w:ascii="Arial" w:cs="Arial" w:eastAsia="Arial" w:hAnsi="Arial"/>
+      <w:i w:val="0"/>
+      <w:iCs w:val="0"/>
       <w:color w:val="666666"/>
       <w:sz w:val="30"/>
       <w:szCs w:val="30"/>

</xml_diff>